<commit_message>
Sync frontend, backend, and database updates for the latest development pass.
This commit captures the current full project state on dev-samarth, including API/backend enhancements, frontend feature updates, migration additions, and documentation artifacts.

Made-with: Cursor
</commit_message>
<xml_diff>
--- a/Activity_Logs_Full_Documentation.docx
+++ b/Activity_Logs_Full_Documentation.docx
@@ -1096,7 +1096,7 @@
                 <w:i w:val="0"/>
                 <w:sz w:val="16"/>
               </w:rPr>
-              <w:t>None</w:t>
+              <w:t>Own only (DB-level)</w:t>
             </w:r>
           </w:p>
         </w:tc>
@@ -1122,7 +1122,7 @@
                 <w:i w:val="0"/>
                 <w:sz w:val="16"/>
               </w:rPr>
-              <w:t>Minimal access — no audit visibility.</w:t>
+              <w:t>Most restricted. No /activity frontend page (route guard blocks). However the 'Users see own' RLS policy applies to all authenticated users — guest CAN query own auth_audit and audit_logs rows directly via the Supabase SDK. Frontend UI is the only blocked layer (intentional design: permissive at DB, restricted at UI).</w:t>
             </w:r>
           </w:p>
         </w:tc>
@@ -1573,7 +1573,7 @@
         </w:tc>
         <w:tc>
           <w:tcPr>
-            <w:tcW w:type="dxa" w:w="2268"/>
+            <w:tcW w:type="dxa" w:w="2551"/>
             <w:vAlign w:val="center"/>
             <w:shd w:val="clear" w:color="auto" w:fill="1a1a2e"/>
             <w:tcBorders>
@@ -1654,7 +1654,7 @@
         </w:tc>
         <w:tc>
           <w:tcPr>
-            <w:tcW w:type="dxa" w:w="2835"/>
+            <w:tcW w:type="dxa" w:w="2551"/>
             <w:vAlign w:val="center"/>
             <w:shd w:val="clear" w:color="auto" w:fill="1a1a2e"/>
             <w:tcBorders>
@@ -1709,7 +1709,7 @@
         </w:tc>
         <w:tc>
           <w:tcPr>
-            <w:tcW w:type="dxa" w:w="2268"/>
+            <w:tcW w:type="dxa" w:w="2551"/>
             <w:vAlign w:val="center"/>
             <w:shd w:val="clear" w:color="auto" w:fill="f8f9fa"/>
             <w:tcBorders>
@@ -1787,7 +1787,7 @@
         </w:tc>
         <w:tc>
           <w:tcPr>
-            <w:tcW w:type="dxa" w:w="2835"/>
+            <w:tcW w:type="dxa" w:w="2551"/>
             <w:vAlign w:val="center"/>
             <w:shd w:val="clear" w:color="auto" w:fill="f8f9fa"/>
             <w:tcBorders>
@@ -1841,7 +1841,7 @@
         </w:tc>
         <w:tc>
           <w:tcPr>
-            <w:tcW w:type="dxa" w:w="2268"/>
+            <w:tcW w:type="dxa" w:w="2551"/>
             <w:vAlign w:val="center"/>
             <w:shd w:val="clear" w:color="auto" w:fill="FFFFFF"/>
             <w:tcBorders>
@@ -1913,13 +1913,13 @@
                 <w:i w:val="0"/>
                 <w:sz w:val="16"/>
               </w:rPr>
-              <w:t>user/viewer</w:t>
+              <w:t>user/viewer/guest ¹</w:t>
             </w:r>
           </w:p>
         </w:tc>
         <w:tc>
           <w:tcPr>
-            <w:tcW w:type="dxa" w:w="2835"/>
+            <w:tcW w:type="dxa" w:w="2551"/>
             <w:vAlign w:val="center"/>
             <w:shd w:val="clear" w:color="auto" w:fill="FFFFFF"/>
             <w:tcBorders>
@@ -1973,7 +1973,7 @@
         </w:tc>
         <w:tc>
           <w:tcPr>
-            <w:tcW w:type="dxa" w:w="2268"/>
+            <w:tcW w:type="dxa" w:w="2551"/>
             <w:vAlign w:val="center"/>
             <w:shd w:val="clear" w:color="auto" w:fill="f8f9fa"/>
             <w:tcBorders>
@@ -1993,7 +1993,7 @@
                 <w:i w:val="0"/>
                 <w:sz w:val="16"/>
               </w:rPr>
-              <w:t>Admins see user+admin</w:t>
+              <w:t>Admins see all except global_admin</w:t>
             </w:r>
           </w:p>
         </w:tc>
@@ -2051,7 +2051,7 @@
         </w:tc>
         <w:tc>
           <w:tcPr>
-            <w:tcW w:type="dxa" w:w="2835"/>
+            <w:tcW w:type="dxa" w:w="2551"/>
             <w:vAlign w:val="center"/>
             <w:shd w:val="clear" w:color="auto" w:fill="f8f9fa"/>
             <w:tcBorders>
@@ -2071,7 +2071,7 @@
                 <w:i w:val="0"/>
                 <w:sz w:val="16"/>
               </w:rPr>
-              <w:t>role IN (admin,user,viewer,guest)</w:t>
+              <w:t>role IN ('admin','user','viewer','guest')</w:t>
             </w:r>
           </w:p>
         </w:tc>
@@ -2105,7 +2105,7 @@
         </w:tc>
         <w:tc>
           <w:tcPr>
-            <w:tcW w:type="dxa" w:w="2268"/>
+            <w:tcW w:type="dxa" w:w="2551"/>
             <w:vAlign w:val="center"/>
             <w:shd w:val="clear" w:color="auto" w:fill="FFFFFF"/>
             <w:tcBorders>
@@ -2183,7 +2183,7 @@
         </w:tc>
         <w:tc>
           <w:tcPr>
-            <w:tcW w:type="dxa" w:w="2835"/>
+            <w:tcW w:type="dxa" w:w="2551"/>
             <w:vAlign w:val="center"/>
             <w:shd w:val="clear" w:color="auto" w:fill="FFFFFF"/>
             <w:tcBorders>
@@ -2237,7 +2237,7 @@
         </w:tc>
         <w:tc>
           <w:tcPr>
-            <w:tcW w:type="dxa" w:w="2268"/>
+            <w:tcW w:type="dxa" w:w="2551"/>
             <w:vAlign w:val="center"/>
             <w:shd w:val="clear" w:color="auto" w:fill="f8f9fa"/>
             <w:tcBorders>
@@ -2315,7 +2315,7 @@
         </w:tc>
         <w:tc>
           <w:tcPr>
-            <w:tcW w:type="dxa" w:w="2835"/>
+            <w:tcW w:type="dxa" w:w="2551"/>
             <w:vAlign w:val="center"/>
             <w:shd w:val="clear" w:color="auto" w:fill="f8f9fa"/>
             <w:tcBorders>
@@ -2369,7 +2369,7 @@
         </w:tc>
         <w:tc>
           <w:tcPr>
-            <w:tcW w:type="dxa" w:w="2268"/>
+            <w:tcW w:type="dxa" w:w="2551"/>
             <w:vAlign w:val="center"/>
             <w:shd w:val="clear" w:color="auto" w:fill="FFFFFF"/>
             <w:tcBorders>
@@ -2447,7 +2447,7 @@
         </w:tc>
         <w:tc>
           <w:tcPr>
-            <w:tcW w:type="dxa" w:w="2835"/>
+            <w:tcW w:type="dxa" w:w="2551"/>
             <w:vAlign w:val="center"/>
             <w:shd w:val="clear" w:color="auto" w:fill="FFFFFF"/>
             <w:tcBorders>
@@ -2501,7 +2501,7 @@
         </w:tc>
         <w:tc>
           <w:tcPr>
-            <w:tcW w:type="dxa" w:w="2268"/>
+            <w:tcW w:type="dxa" w:w="2551"/>
             <w:vAlign w:val="center"/>
             <w:shd w:val="clear" w:color="auto" w:fill="f8f9fa"/>
             <w:tcBorders>
@@ -2579,7 +2579,7 @@
         </w:tc>
         <w:tc>
           <w:tcPr>
-            <w:tcW w:type="dxa" w:w="2835"/>
+            <w:tcW w:type="dxa" w:w="2551"/>
             <w:vAlign w:val="center"/>
             <w:shd w:val="clear" w:color="auto" w:fill="f8f9fa"/>
             <w:tcBorders>
@@ -2633,7 +2633,7 @@
         </w:tc>
         <w:tc>
           <w:tcPr>
-            <w:tcW w:type="dxa" w:w="2268"/>
+            <w:tcW w:type="dxa" w:w="2551"/>
             <w:vAlign w:val="center"/>
             <w:shd w:val="clear" w:color="auto" w:fill="FFFFFF"/>
             <w:tcBorders>
@@ -2711,7 +2711,7 @@
         </w:tc>
         <w:tc>
           <w:tcPr>
-            <w:tcW w:type="dxa" w:w="2835"/>
+            <w:tcW w:type="dxa" w:w="2551"/>
             <w:vAlign w:val="center"/>
             <w:shd w:val="clear" w:color="auto" w:fill="FFFFFF"/>
             <w:tcBorders>
@@ -2765,7 +2765,7 @@
         </w:tc>
         <w:tc>
           <w:tcPr>
-            <w:tcW w:type="dxa" w:w="2268"/>
+            <w:tcW w:type="dxa" w:w="2551"/>
             <w:vAlign w:val="center"/>
             <w:shd w:val="clear" w:color="auto" w:fill="f8f9fa"/>
             <w:tcBorders>
@@ -2843,7 +2843,7 @@
         </w:tc>
         <w:tc>
           <w:tcPr>
-            <w:tcW w:type="dxa" w:w="2835"/>
+            <w:tcW w:type="dxa" w:w="2551"/>
             <w:vAlign w:val="center"/>
             <w:shd w:val="clear" w:color="auto" w:fill="f8f9fa"/>
             <w:tcBorders>
@@ -2870,6 +2870,14 @@
       </w:tr>
     </w:tbl>
     <w:p/>
+    <w:p>
+      <w:pPr>
+        <w:spacing w:after="120"/>
+      </w:pPr>
+      <w:r>
+        <w:t>¹ Guest &amp; 'Users see own': The policy has no role restriction — the condition user_id = auth.uid() applies to ALL authenticated users including guest. Guest can therefore query their own auth_audit and audit_logs rows at the DB level. The /activity frontend page is blocked by the route guard for UX reasons, not by RLS. Design intent: permissive at DB, restricted at UI layer.</w:t>
+      </w:r>
+    </w:p>
     <w:p>
       <w:r>
         <w:br w:type="page"/>
@@ -3131,7 +3139,7 @@
         <w:spacing w:after="120"/>
       </w:pPr>
       <w:r>
-        <w:t>When any authenticated user navigates to /activity, Activity.tsx issues a SELECT query. The Supabase RLS layer automatically filters rows based on the caller's role — global_admin sees all, admin sees most, user/viewer sees only their own rows, and guest receives nothing.</w:t>
+        <w:t>When any authenticated user navigates to /activity, Activity.tsx issues a SELECT query. The Supabase RLS layer automatically filters rows based on the caller's role — global_admin sees all, admin sees most (all except global_admin rows), user/viewer sees only their own rows. Guest receives 0 rows through the frontend (route guard blocks the /activity page) but CAN read own rows at the DB level via the 'Users see own' RLS policy — the frontend is the restriction layer, not RLS.</w:t>
       </w:r>
     </w:p>
     <w:p>
@@ -3567,6 +3575,1950 @@
           <w:sz w:val="16"/>
         </w:rPr>
         <w:t>Figure 12 — Full Access Control Matrix</w:t>
+      </w:r>
+    </w:p>
+    <w:p>
+      <w:pPr>
+        <w:pStyle w:val="Heading2"/>
+        <w:jc w:val="left"/>
+      </w:pPr>
+      <w:r>
+        <w:t>Detailed Access Matrix</w:t>
+      </w:r>
+    </w:p>
+    <w:tbl>
+      <w:tblPr>
+        <w:tblStyle w:val="TableGrid"/>
+        <w:tblW w:type="auto" w:w="0"/>
+        <w:jc w:val="left"/>
+        <w:tblLook w:firstColumn="1" w:firstRow="1" w:lastColumn="0" w:lastRow="0" w:noHBand="0" w:noVBand="1" w:val="04A0"/>
+      </w:tblPr>
+      <w:tblGrid>
+        <w:gridCol w:w="1568"/>
+        <w:gridCol w:w="1568"/>
+        <w:gridCol w:w="1568"/>
+        <w:gridCol w:w="1568"/>
+        <w:gridCol w:w="1568"/>
+        <w:gridCol w:w="1568"/>
+      </w:tblGrid>
+      <w:tr>
+        <w:tc>
+          <w:tcPr>
+            <w:tcW w:type="dxa" w:w="3118"/>
+            <w:vAlign w:val="center"/>
+            <w:shd w:val="clear" w:color="auto" w:fill="1a1a2e"/>
+            <w:tcBorders>
+              <w:top w:val="single" w:sz="4" w:space="0" w:color="dee2e6"/>
+              <w:left w:val="single" w:sz="4" w:space="0" w:color="dee2e6"/>
+              <w:bottom w:val="single" w:sz="4" w:space="0" w:color="dee2e6"/>
+              <w:right w:val="single" w:sz="4" w:space="0" w:color="dee2e6"/>
+            </w:tcBorders>
+          </w:tcPr>
+          <w:p>
+            <w:pPr>
+              <w:jc w:val="left"/>
+            </w:pPr>
+            <w:r>
+              <w:rPr>
+                <w:b/>
+                <w:i w:val="0"/>
+                <w:color w:val="FFFFFF"/>
+                <w:sz w:val="16"/>
+              </w:rPr>
+              <w:t>Data Scope</w:t>
+            </w:r>
+          </w:p>
+        </w:tc>
+        <w:tc>
+          <w:tcPr>
+            <w:tcW w:type="dxa" w:w="1247"/>
+            <w:vAlign w:val="center"/>
+            <w:shd w:val="clear" w:color="auto" w:fill="1a1a2e"/>
+            <w:tcBorders>
+              <w:top w:val="single" w:sz="4" w:space="0" w:color="dee2e6"/>
+              <w:left w:val="single" w:sz="4" w:space="0" w:color="dee2e6"/>
+              <w:bottom w:val="single" w:sz="4" w:space="0" w:color="dee2e6"/>
+              <w:right w:val="single" w:sz="4" w:space="0" w:color="dee2e6"/>
+            </w:tcBorders>
+          </w:tcPr>
+          <w:p>
+            <w:pPr>
+              <w:jc w:val="left"/>
+            </w:pPr>
+            <w:r>
+              <w:rPr>
+                <w:b/>
+                <w:i w:val="0"/>
+                <w:color w:val="FFFFFF"/>
+                <w:sz w:val="16"/>
+              </w:rPr>
+              <w:t>global_admin</w:t>
+            </w:r>
+          </w:p>
+        </w:tc>
+        <w:tc>
+          <w:tcPr>
+            <w:tcW w:type="dxa" w:w="1247"/>
+            <w:vAlign w:val="center"/>
+            <w:shd w:val="clear" w:color="auto" w:fill="1a1a2e"/>
+            <w:tcBorders>
+              <w:top w:val="single" w:sz="4" w:space="0" w:color="dee2e6"/>
+              <w:left w:val="single" w:sz="4" w:space="0" w:color="dee2e6"/>
+              <w:bottom w:val="single" w:sz="4" w:space="0" w:color="dee2e6"/>
+              <w:right w:val="single" w:sz="4" w:space="0" w:color="dee2e6"/>
+            </w:tcBorders>
+          </w:tcPr>
+          <w:p>
+            <w:pPr>
+              <w:jc w:val="left"/>
+            </w:pPr>
+            <w:r>
+              <w:rPr>
+                <w:b/>
+                <w:i w:val="0"/>
+                <w:color w:val="FFFFFF"/>
+                <w:sz w:val="16"/>
+              </w:rPr>
+              <w:t>admin</w:t>
+            </w:r>
+          </w:p>
+        </w:tc>
+        <w:tc>
+          <w:tcPr>
+            <w:tcW w:type="dxa" w:w="1134"/>
+            <w:vAlign w:val="center"/>
+            <w:shd w:val="clear" w:color="auto" w:fill="1a1a2e"/>
+            <w:tcBorders>
+              <w:top w:val="single" w:sz="4" w:space="0" w:color="dee2e6"/>
+              <w:left w:val="single" w:sz="4" w:space="0" w:color="dee2e6"/>
+              <w:bottom w:val="single" w:sz="4" w:space="0" w:color="dee2e6"/>
+              <w:right w:val="single" w:sz="4" w:space="0" w:color="dee2e6"/>
+            </w:tcBorders>
+          </w:tcPr>
+          <w:p>
+            <w:pPr>
+              <w:jc w:val="left"/>
+            </w:pPr>
+            <w:r>
+              <w:rPr>
+                <w:b/>
+                <w:i w:val="0"/>
+                <w:color w:val="FFFFFF"/>
+                <w:sz w:val="16"/>
+              </w:rPr>
+              <w:t>user</w:t>
+            </w:r>
+          </w:p>
+        </w:tc>
+        <w:tc>
+          <w:tcPr>
+            <w:tcW w:type="dxa" w:w="1134"/>
+            <w:vAlign w:val="center"/>
+            <w:shd w:val="clear" w:color="auto" w:fill="1a1a2e"/>
+            <w:tcBorders>
+              <w:top w:val="single" w:sz="4" w:space="0" w:color="dee2e6"/>
+              <w:left w:val="single" w:sz="4" w:space="0" w:color="dee2e6"/>
+              <w:bottom w:val="single" w:sz="4" w:space="0" w:color="dee2e6"/>
+              <w:right w:val="single" w:sz="4" w:space="0" w:color="dee2e6"/>
+            </w:tcBorders>
+          </w:tcPr>
+          <w:p>
+            <w:pPr>
+              <w:jc w:val="left"/>
+            </w:pPr>
+            <w:r>
+              <w:rPr>
+                <w:b/>
+                <w:i w:val="0"/>
+                <w:color w:val="FFFFFF"/>
+                <w:sz w:val="16"/>
+              </w:rPr>
+              <w:t>viewer</w:t>
+            </w:r>
+          </w:p>
+        </w:tc>
+        <w:tc>
+          <w:tcPr>
+            <w:tcW w:type="dxa" w:w="1871"/>
+            <w:vAlign w:val="center"/>
+            <w:shd w:val="clear" w:color="auto" w:fill="1a1a2e"/>
+            <w:tcBorders>
+              <w:top w:val="single" w:sz="4" w:space="0" w:color="dee2e6"/>
+              <w:left w:val="single" w:sz="4" w:space="0" w:color="dee2e6"/>
+              <w:bottom w:val="single" w:sz="4" w:space="0" w:color="dee2e6"/>
+              <w:right w:val="single" w:sz="4" w:space="0" w:color="dee2e6"/>
+            </w:tcBorders>
+          </w:tcPr>
+          <w:p>
+            <w:pPr>
+              <w:jc w:val="left"/>
+            </w:pPr>
+            <w:r>
+              <w:rPr>
+                <w:b/>
+                <w:i w:val="0"/>
+                <w:color w:val="FFFFFF"/>
+                <w:sz w:val="16"/>
+              </w:rPr>
+              <w:t>guest</w:t>
+            </w:r>
+          </w:p>
+        </w:tc>
+      </w:tr>
+      <w:tr>
+        <w:tc>
+          <w:tcPr>
+            <w:tcW w:type="dxa" w:w="3118"/>
+            <w:vAlign w:val="center"/>
+            <w:shd w:val="clear" w:color="auto" w:fill="f8f9fa"/>
+            <w:tcBorders>
+              <w:top w:val="single" w:sz="4" w:space="0" w:color="dee2e6"/>
+              <w:left w:val="single" w:sz="4" w:space="0" w:color="dee2e6"/>
+              <w:bottom w:val="single" w:sz="4" w:space="0" w:color="dee2e6"/>
+              <w:right w:val="single" w:sz="4" w:space="0" w:color="dee2e6"/>
+            </w:tcBorders>
+          </w:tcPr>
+          <w:p>
+            <w:pPr>
+              <w:jc w:val="left"/>
+            </w:pPr>
+            <w:r>
+              <w:rPr>
+                <w:b w:val="0"/>
+                <w:i w:val="0"/>
+                <w:sz w:val="16"/>
+              </w:rPr>
+              <w:t>Access /activity page (UI)</w:t>
+            </w:r>
+          </w:p>
+        </w:tc>
+        <w:tc>
+          <w:tcPr>
+            <w:tcW w:type="dxa" w:w="1247"/>
+            <w:vAlign w:val="center"/>
+            <w:shd w:val="clear" w:color="auto" w:fill="f8f9fa"/>
+            <w:tcBorders>
+              <w:top w:val="single" w:sz="4" w:space="0" w:color="dee2e6"/>
+              <w:left w:val="single" w:sz="4" w:space="0" w:color="dee2e6"/>
+              <w:bottom w:val="single" w:sz="4" w:space="0" w:color="dee2e6"/>
+              <w:right w:val="single" w:sz="4" w:space="0" w:color="dee2e6"/>
+            </w:tcBorders>
+          </w:tcPr>
+          <w:p>
+            <w:pPr>
+              <w:jc w:val="left"/>
+            </w:pPr>
+            <w:r>
+              <w:rPr>
+                <w:b w:val="0"/>
+                <w:i w:val="0"/>
+                <w:sz w:val="16"/>
+              </w:rPr>
+              <w:t>YES</w:t>
+            </w:r>
+          </w:p>
+        </w:tc>
+        <w:tc>
+          <w:tcPr>
+            <w:tcW w:type="dxa" w:w="1247"/>
+            <w:vAlign w:val="center"/>
+            <w:shd w:val="clear" w:color="auto" w:fill="f8f9fa"/>
+            <w:tcBorders>
+              <w:top w:val="single" w:sz="4" w:space="0" w:color="dee2e6"/>
+              <w:left w:val="single" w:sz="4" w:space="0" w:color="dee2e6"/>
+              <w:bottom w:val="single" w:sz="4" w:space="0" w:color="dee2e6"/>
+              <w:right w:val="single" w:sz="4" w:space="0" w:color="dee2e6"/>
+            </w:tcBorders>
+          </w:tcPr>
+          <w:p>
+            <w:pPr>
+              <w:jc w:val="left"/>
+            </w:pPr>
+            <w:r>
+              <w:rPr>
+                <w:b w:val="0"/>
+                <w:i w:val="0"/>
+                <w:sz w:val="16"/>
+              </w:rPr>
+              <w:t>YES</w:t>
+            </w:r>
+          </w:p>
+        </w:tc>
+        <w:tc>
+          <w:tcPr>
+            <w:tcW w:type="dxa" w:w="1134"/>
+            <w:vAlign w:val="center"/>
+            <w:shd w:val="clear" w:color="auto" w:fill="f8f9fa"/>
+            <w:tcBorders>
+              <w:top w:val="single" w:sz="4" w:space="0" w:color="dee2e6"/>
+              <w:left w:val="single" w:sz="4" w:space="0" w:color="dee2e6"/>
+              <w:bottom w:val="single" w:sz="4" w:space="0" w:color="dee2e6"/>
+              <w:right w:val="single" w:sz="4" w:space="0" w:color="dee2e6"/>
+            </w:tcBorders>
+          </w:tcPr>
+          <w:p>
+            <w:pPr>
+              <w:jc w:val="left"/>
+            </w:pPr>
+            <w:r>
+              <w:rPr>
+                <w:b w:val="0"/>
+                <w:i w:val="0"/>
+                <w:sz w:val="16"/>
+              </w:rPr>
+              <w:t>YES</w:t>
+            </w:r>
+          </w:p>
+        </w:tc>
+        <w:tc>
+          <w:tcPr>
+            <w:tcW w:type="dxa" w:w="1134"/>
+            <w:vAlign w:val="center"/>
+            <w:shd w:val="clear" w:color="auto" w:fill="f8f9fa"/>
+            <w:tcBorders>
+              <w:top w:val="single" w:sz="4" w:space="0" w:color="dee2e6"/>
+              <w:left w:val="single" w:sz="4" w:space="0" w:color="dee2e6"/>
+              <w:bottom w:val="single" w:sz="4" w:space="0" w:color="dee2e6"/>
+              <w:right w:val="single" w:sz="4" w:space="0" w:color="dee2e6"/>
+            </w:tcBorders>
+          </w:tcPr>
+          <w:p>
+            <w:pPr>
+              <w:jc w:val="left"/>
+            </w:pPr>
+            <w:r>
+              <w:rPr>
+                <w:b w:val="0"/>
+                <w:i w:val="0"/>
+                <w:sz w:val="16"/>
+              </w:rPr>
+              <w:t>YES</w:t>
+            </w:r>
+          </w:p>
+        </w:tc>
+        <w:tc>
+          <w:tcPr>
+            <w:tcW w:type="dxa" w:w="1871"/>
+            <w:vAlign w:val="center"/>
+            <w:shd w:val="clear" w:color="auto" w:fill="f8f9fa"/>
+            <w:tcBorders>
+              <w:top w:val="single" w:sz="4" w:space="0" w:color="dee2e6"/>
+              <w:left w:val="single" w:sz="4" w:space="0" w:color="dee2e6"/>
+              <w:bottom w:val="single" w:sz="4" w:space="0" w:color="dee2e6"/>
+              <w:right w:val="single" w:sz="4" w:space="0" w:color="dee2e6"/>
+            </w:tcBorders>
+          </w:tcPr>
+          <w:p>
+            <w:pPr>
+              <w:jc w:val="left"/>
+            </w:pPr>
+            <w:r>
+              <w:rPr>
+                <w:b w:val="0"/>
+                <w:i w:val="0"/>
+                <w:sz w:val="16"/>
+              </w:rPr>
+              <w:t>NO (route guard)</w:t>
+            </w:r>
+          </w:p>
+        </w:tc>
+      </w:tr>
+      <w:tr>
+        <w:tc>
+          <w:tcPr>
+            <w:tcW w:type="dxa" w:w="3118"/>
+            <w:vAlign w:val="center"/>
+            <w:shd w:val="clear" w:color="auto" w:fill="FFFFFF"/>
+            <w:tcBorders>
+              <w:top w:val="single" w:sz="4" w:space="0" w:color="dee2e6"/>
+              <w:left w:val="single" w:sz="4" w:space="0" w:color="dee2e6"/>
+              <w:bottom w:val="single" w:sz="4" w:space="0" w:color="dee2e6"/>
+              <w:right w:val="single" w:sz="4" w:space="0" w:color="dee2e6"/>
+            </w:tcBorders>
+          </w:tcPr>
+          <w:p>
+            <w:pPr>
+              <w:jc w:val="left"/>
+            </w:pPr>
+            <w:r>
+              <w:rPr>
+                <w:b w:val="0"/>
+                <w:i w:val="0"/>
+                <w:sz w:val="16"/>
+              </w:rPr>
+              <w:t>Own auth_audit rows (DB via RLS)</w:t>
+            </w:r>
+          </w:p>
+        </w:tc>
+        <w:tc>
+          <w:tcPr>
+            <w:tcW w:type="dxa" w:w="1247"/>
+            <w:vAlign w:val="center"/>
+            <w:shd w:val="clear" w:color="auto" w:fill="FFFFFF"/>
+            <w:tcBorders>
+              <w:top w:val="single" w:sz="4" w:space="0" w:color="dee2e6"/>
+              <w:left w:val="single" w:sz="4" w:space="0" w:color="dee2e6"/>
+              <w:bottom w:val="single" w:sz="4" w:space="0" w:color="dee2e6"/>
+              <w:right w:val="single" w:sz="4" w:space="0" w:color="dee2e6"/>
+            </w:tcBorders>
+          </w:tcPr>
+          <w:p>
+            <w:pPr>
+              <w:jc w:val="left"/>
+            </w:pPr>
+            <w:r>
+              <w:rPr>
+                <w:b w:val="0"/>
+                <w:i w:val="0"/>
+                <w:sz w:val="16"/>
+              </w:rPr>
+              <w:t>YES</w:t>
+            </w:r>
+          </w:p>
+        </w:tc>
+        <w:tc>
+          <w:tcPr>
+            <w:tcW w:type="dxa" w:w="1247"/>
+            <w:vAlign w:val="center"/>
+            <w:shd w:val="clear" w:color="auto" w:fill="FFFFFF"/>
+            <w:tcBorders>
+              <w:top w:val="single" w:sz="4" w:space="0" w:color="dee2e6"/>
+              <w:left w:val="single" w:sz="4" w:space="0" w:color="dee2e6"/>
+              <w:bottom w:val="single" w:sz="4" w:space="0" w:color="dee2e6"/>
+              <w:right w:val="single" w:sz="4" w:space="0" w:color="dee2e6"/>
+            </w:tcBorders>
+          </w:tcPr>
+          <w:p>
+            <w:pPr>
+              <w:jc w:val="left"/>
+            </w:pPr>
+            <w:r>
+              <w:rPr>
+                <w:b w:val="0"/>
+                <w:i w:val="0"/>
+                <w:sz w:val="16"/>
+              </w:rPr>
+              <w:t>YES</w:t>
+            </w:r>
+          </w:p>
+        </w:tc>
+        <w:tc>
+          <w:tcPr>
+            <w:tcW w:type="dxa" w:w="1134"/>
+            <w:vAlign w:val="center"/>
+            <w:shd w:val="clear" w:color="auto" w:fill="FFFFFF"/>
+            <w:tcBorders>
+              <w:top w:val="single" w:sz="4" w:space="0" w:color="dee2e6"/>
+              <w:left w:val="single" w:sz="4" w:space="0" w:color="dee2e6"/>
+              <w:bottom w:val="single" w:sz="4" w:space="0" w:color="dee2e6"/>
+              <w:right w:val="single" w:sz="4" w:space="0" w:color="dee2e6"/>
+            </w:tcBorders>
+          </w:tcPr>
+          <w:p>
+            <w:pPr>
+              <w:jc w:val="left"/>
+            </w:pPr>
+            <w:r>
+              <w:rPr>
+                <w:b w:val="0"/>
+                <w:i w:val="0"/>
+                <w:sz w:val="16"/>
+              </w:rPr>
+              <w:t>YES</w:t>
+            </w:r>
+          </w:p>
+        </w:tc>
+        <w:tc>
+          <w:tcPr>
+            <w:tcW w:type="dxa" w:w="1134"/>
+            <w:vAlign w:val="center"/>
+            <w:shd w:val="clear" w:color="auto" w:fill="FFFFFF"/>
+            <w:tcBorders>
+              <w:top w:val="single" w:sz="4" w:space="0" w:color="dee2e6"/>
+              <w:left w:val="single" w:sz="4" w:space="0" w:color="dee2e6"/>
+              <w:bottom w:val="single" w:sz="4" w:space="0" w:color="dee2e6"/>
+              <w:right w:val="single" w:sz="4" w:space="0" w:color="dee2e6"/>
+            </w:tcBorders>
+          </w:tcPr>
+          <w:p>
+            <w:pPr>
+              <w:jc w:val="left"/>
+            </w:pPr>
+            <w:r>
+              <w:rPr>
+                <w:b w:val="0"/>
+                <w:i w:val="0"/>
+                <w:sz w:val="16"/>
+              </w:rPr>
+              <w:t>YES</w:t>
+            </w:r>
+          </w:p>
+        </w:tc>
+        <w:tc>
+          <w:tcPr>
+            <w:tcW w:type="dxa" w:w="1871"/>
+            <w:vAlign w:val="center"/>
+            <w:shd w:val="clear" w:color="auto" w:fill="FFFFFF"/>
+            <w:tcBorders>
+              <w:top w:val="single" w:sz="4" w:space="0" w:color="dee2e6"/>
+              <w:left w:val="single" w:sz="4" w:space="0" w:color="dee2e6"/>
+              <w:bottom w:val="single" w:sz="4" w:space="0" w:color="dee2e6"/>
+              <w:right w:val="single" w:sz="4" w:space="0" w:color="dee2e6"/>
+            </w:tcBorders>
+          </w:tcPr>
+          <w:p>
+            <w:pPr>
+              <w:jc w:val="left"/>
+            </w:pPr>
+            <w:r>
+              <w:rPr>
+                <w:b w:val="0"/>
+                <w:i w:val="0"/>
+                <w:sz w:val="16"/>
+              </w:rPr>
+              <w:t>YES ¹</w:t>
+            </w:r>
+          </w:p>
+        </w:tc>
+      </w:tr>
+      <w:tr>
+        <w:tc>
+          <w:tcPr>
+            <w:tcW w:type="dxa" w:w="3118"/>
+            <w:vAlign w:val="center"/>
+            <w:shd w:val="clear" w:color="auto" w:fill="f8f9fa"/>
+            <w:tcBorders>
+              <w:top w:val="single" w:sz="4" w:space="0" w:color="dee2e6"/>
+              <w:left w:val="single" w:sz="4" w:space="0" w:color="dee2e6"/>
+              <w:bottom w:val="single" w:sz="4" w:space="0" w:color="dee2e6"/>
+              <w:right w:val="single" w:sz="4" w:space="0" w:color="dee2e6"/>
+            </w:tcBorders>
+          </w:tcPr>
+          <w:p>
+            <w:pPr>
+              <w:jc w:val="left"/>
+            </w:pPr>
+            <w:r>
+              <w:rPr>
+                <w:b w:val="0"/>
+                <w:i w:val="0"/>
+                <w:sz w:val="16"/>
+              </w:rPr>
+              <w:t>Own audit_logs rows (DB via RLS)</w:t>
+            </w:r>
+          </w:p>
+        </w:tc>
+        <w:tc>
+          <w:tcPr>
+            <w:tcW w:type="dxa" w:w="1247"/>
+            <w:vAlign w:val="center"/>
+            <w:shd w:val="clear" w:color="auto" w:fill="f8f9fa"/>
+            <w:tcBorders>
+              <w:top w:val="single" w:sz="4" w:space="0" w:color="dee2e6"/>
+              <w:left w:val="single" w:sz="4" w:space="0" w:color="dee2e6"/>
+              <w:bottom w:val="single" w:sz="4" w:space="0" w:color="dee2e6"/>
+              <w:right w:val="single" w:sz="4" w:space="0" w:color="dee2e6"/>
+            </w:tcBorders>
+          </w:tcPr>
+          <w:p>
+            <w:pPr>
+              <w:jc w:val="left"/>
+            </w:pPr>
+            <w:r>
+              <w:rPr>
+                <w:b w:val="0"/>
+                <w:i w:val="0"/>
+                <w:sz w:val="16"/>
+              </w:rPr>
+              <w:t>YES</w:t>
+            </w:r>
+          </w:p>
+        </w:tc>
+        <w:tc>
+          <w:tcPr>
+            <w:tcW w:type="dxa" w:w="1247"/>
+            <w:vAlign w:val="center"/>
+            <w:shd w:val="clear" w:color="auto" w:fill="f8f9fa"/>
+            <w:tcBorders>
+              <w:top w:val="single" w:sz="4" w:space="0" w:color="dee2e6"/>
+              <w:left w:val="single" w:sz="4" w:space="0" w:color="dee2e6"/>
+              <w:bottom w:val="single" w:sz="4" w:space="0" w:color="dee2e6"/>
+              <w:right w:val="single" w:sz="4" w:space="0" w:color="dee2e6"/>
+            </w:tcBorders>
+          </w:tcPr>
+          <w:p>
+            <w:pPr>
+              <w:jc w:val="left"/>
+            </w:pPr>
+            <w:r>
+              <w:rPr>
+                <w:b w:val="0"/>
+                <w:i w:val="0"/>
+                <w:sz w:val="16"/>
+              </w:rPr>
+              <w:t>YES</w:t>
+            </w:r>
+          </w:p>
+        </w:tc>
+        <w:tc>
+          <w:tcPr>
+            <w:tcW w:type="dxa" w:w="1134"/>
+            <w:vAlign w:val="center"/>
+            <w:shd w:val="clear" w:color="auto" w:fill="f8f9fa"/>
+            <w:tcBorders>
+              <w:top w:val="single" w:sz="4" w:space="0" w:color="dee2e6"/>
+              <w:left w:val="single" w:sz="4" w:space="0" w:color="dee2e6"/>
+              <w:bottom w:val="single" w:sz="4" w:space="0" w:color="dee2e6"/>
+              <w:right w:val="single" w:sz="4" w:space="0" w:color="dee2e6"/>
+            </w:tcBorders>
+          </w:tcPr>
+          <w:p>
+            <w:pPr>
+              <w:jc w:val="left"/>
+            </w:pPr>
+            <w:r>
+              <w:rPr>
+                <w:b w:val="0"/>
+                <w:i w:val="0"/>
+                <w:sz w:val="16"/>
+              </w:rPr>
+              <w:t>YES</w:t>
+            </w:r>
+          </w:p>
+        </w:tc>
+        <w:tc>
+          <w:tcPr>
+            <w:tcW w:type="dxa" w:w="1134"/>
+            <w:vAlign w:val="center"/>
+            <w:shd w:val="clear" w:color="auto" w:fill="f8f9fa"/>
+            <w:tcBorders>
+              <w:top w:val="single" w:sz="4" w:space="0" w:color="dee2e6"/>
+              <w:left w:val="single" w:sz="4" w:space="0" w:color="dee2e6"/>
+              <w:bottom w:val="single" w:sz="4" w:space="0" w:color="dee2e6"/>
+              <w:right w:val="single" w:sz="4" w:space="0" w:color="dee2e6"/>
+            </w:tcBorders>
+          </w:tcPr>
+          <w:p>
+            <w:pPr>
+              <w:jc w:val="left"/>
+            </w:pPr>
+            <w:r>
+              <w:rPr>
+                <w:b w:val="0"/>
+                <w:i w:val="0"/>
+                <w:sz w:val="16"/>
+              </w:rPr>
+              <w:t>YES</w:t>
+            </w:r>
+          </w:p>
+        </w:tc>
+        <w:tc>
+          <w:tcPr>
+            <w:tcW w:type="dxa" w:w="1871"/>
+            <w:vAlign w:val="center"/>
+            <w:shd w:val="clear" w:color="auto" w:fill="f8f9fa"/>
+            <w:tcBorders>
+              <w:top w:val="single" w:sz="4" w:space="0" w:color="dee2e6"/>
+              <w:left w:val="single" w:sz="4" w:space="0" w:color="dee2e6"/>
+              <w:bottom w:val="single" w:sz="4" w:space="0" w:color="dee2e6"/>
+              <w:right w:val="single" w:sz="4" w:space="0" w:color="dee2e6"/>
+            </w:tcBorders>
+          </w:tcPr>
+          <w:p>
+            <w:pPr>
+              <w:jc w:val="left"/>
+            </w:pPr>
+            <w:r>
+              <w:rPr>
+                <w:b w:val="0"/>
+                <w:i w:val="0"/>
+                <w:sz w:val="16"/>
+              </w:rPr>
+              <w:t>YES ¹</w:t>
+            </w:r>
+          </w:p>
+        </w:tc>
+      </w:tr>
+      <w:tr>
+        <w:tc>
+          <w:tcPr>
+            <w:tcW w:type="dxa" w:w="3118"/>
+            <w:vAlign w:val="center"/>
+            <w:shd w:val="clear" w:color="auto" w:fill="FFFFFF"/>
+            <w:tcBorders>
+              <w:top w:val="single" w:sz="4" w:space="0" w:color="dee2e6"/>
+              <w:left w:val="single" w:sz="4" w:space="0" w:color="dee2e6"/>
+              <w:bottom w:val="single" w:sz="4" w:space="0" w:color="dee2e6"/>
+              <w:right w:val="single" w:sz="4" w:space="0" w:color="dee2e6"/>
+            </w:tcBorders>
+          </w:tcPr>
+          <w:p>
+            <w:pPr>
+              <w:jc w:val="left"/>
+            </w:pPr>
+            <w:r>
+              <w:rPr>
+                <w:b w:val="0"/>
+                <w:i w:val="0"/>
+                <w:sz w:val="16"/>
+              </w:rPr>
+              <w:t>All user role rows</w:t>
+            </w:r>
+          </w:p>
+        </w:tc>
+        <w:tc>
+          <w:tcPr>
+            <w:tcW w:type="dxa" w:w="1247"/>
+            <w:vAlign w:val="center"/>
+            <w:shd w:val="clear" w:color="auto" w:fill="FFFFFF"/>
+            <w:tcBorders>
+              <w:top w:val="single" w:sz="4" w:space="0" w:color="dee2e6"/>
+              <w:left w:val="single" w:sz="4" w:space="0" w:color="dee2e6"/>
+              <w:bottom w:val="single" w:sz="4" w:space="0" w:color="dee2e6"/>
+              <w:right w:val="single" w:sz="4" w:space="0" w:color="dee2e6"/>
+            </w:tcBorders>
+          </w:tcPr>
+          <w:p>
+            <w:pPr>
+              <w:jc w:val="left"/>
+            </w:pPr>
+            <w:r>
+              <w:rPr>
+                <w:b w:val="0"/>
+                <w:i w:val="0"/>
+                <w:sz w:val="16"/>
+              </w:rPr>
+              <w:t>YES</w:t>
+            </w:r>
+          </w:p>
+        </w:tc>
+        <w:tc>
+          <w:tcPr>
+            <w:tcW w:type="dxa" w:w="1247"/>
+            <w:vAlign w:val="center"/>
+            <w:shd w:val="clear" w:color="auto" w:fill="FFFFFF"/>
+            <w:tcBorders>
+              <w:top w:val="single" w:sz="4" w:space="0" w:color="dee2e6"/>
+              <w:left w:val="single" w:sz="4" w:space="0" w:color="dee2e6"/>
+              <w:bottom w:val="single" w:sz="4" w:space="0" w:color="dee2e6"/>
+              <w:right w:val="single" w:sz="4" w:space="0" w:color="dee2e6"/>
+            </w:tcBorders>
+          </w:tcPr>
+          <w:p>
+            <w:pPr>
+              <w:jc w:val="left"/>
+            </w:pPr>
+            <w:r>
+              <w:rPr>
+                <w:b w:val="0"/>
+                <w:i w:val="0"/>
+                <w:sz w:val="16"/>
+              </w:rPr>
+              <w:t>YES</w:t>
+            </w:r>
+          </w:p>
+        </w:tc>
+        <w:tc>
+          <w:tcPr>
+            <w:tcW w:type="dxa" w:w="1134"/>
+            <w:vAlign w:val="center"/>
+            <w:shd w:val="clear" w:color="auto" w:fill="FFFFFF"/>
+            <w:tcBorders>
+              <w:top w:val="single" w:sz="4" w:space="0" w:color="dee2e6"/>
+              <w:left w:val="single" w:sz="4" w:space="0" w:color="dee2e6"/>
+              <w:bottom w:val="single" w:sz="4" w:space="0" w:color="dee2e6"/>
+              <w:right w:val="single" w:sz="4" w:space="0" w:color="dee2e6"/>
+            </w:tcBorders>
+          </w:tcPr>
+          <w:p>
+            <w:pPr>
+              <w:jc w:val="left"/>
+            </w:pPr>
+            <w:r>
+              <w:rPr>
+                <w:b w:val="0"/>
+                <w:i w:val="0"/>
+                <w:sz w:val="16"/>
+              </w:rPr>
+              <w:t>NO</w:t>
+            </w:r>
+          </w:p>
+        </w:tc>
+        <w:tc>
+          <w:tcPr>
+            <w:tcW w:type="dxa" w:w="1134"/>
+            <w:vAlign w:val="center"/>
+            <w:shd w:val="clear" w:color="auto" w:fill="FFFFFF"/>
+            <w:tcBorders>
+              <w:top w:val="single" w:sz="4" w:space="0" w:color="dee2e6"/>
+              <w:left w:val="single" w:sz="4" w:space="0" w:color="dee2e6"/>
+              <w:bottom w:val="single" w:sz="4" w:space="0" w:color="dee2e6"/>
+              <w:right w:val="single" w:sz="4" w:space="0" w:color="dee2e6"/>
+            </w:tcBorders>
+          </w:tcPr>
+          <w:p>
+            <w:pPr>
+              <w:jc w:val="left"/>
+            </w:pPr>
+            <w:r>
+              <w:rPr>
+                <w:b w:val="0"/>
+                <w:i w:val="0"/>
+                <w:sz w:val="16"/>
+              </w:rPr>
+              <w:t>NO</w:t>
+            </w:r>
+          </w:p>
+        </w:tc>
+        <w:tc>
+          <w:tcPr>
+            <w:tcW w:type="dxa" w:w="1871"/>
+            <w:vAlign w:val="center"/>
+            <w:shd w:val="clear" w:color="auto" w:fill="FFFFFF"/>
+            <w:tcBorders>
+              <w:top w:val="single" w:sz="4" w:space="0" w:color="dee2e6"/>
+              <w:left w:val="single" w:sz="4" w:space="0" w:color="dee2e6"/>
+              <w:bottom w:val="single" w:sz="4" w:space="0" w:color="dee2e6"/>
+              <w:right w:val="single" w:sz="4" w:space="0" w:color="dee2e6"/>
+            </w:tcBorders>
+          </w:tcPr>
+          <w:p>
+            <w:pPr>
+              <w:jc w:val="left"/>
+            </w:pPr>
+            <w:r>
+              <w:rPr>
+                <w:b w:val="0"/>
+                <w:i w:val="0"/>
+                <w:sz w:val="16"/>
+              </w:rPr>
+              <w:t>NO</w:t>
+            </w:r>
+          </w:p>
+        </w:tc>
+      </w:tr>
+      <w:tr>
+        <w:tc>
+          <w:tcPr>
+            <w:tcW w:type="dxa" w:w="3118"/>
+            <w:vAlign w:val="center"/>
+            <w:shd w:val="clear" w:color="auto" w:fill="f8f9fa"/>
+            <w:tcBorders>
+              <w:top w:val="single" w:sz="4" w:space="0" w:color="dee2e6"/>
+              <w:left w:val="single" w:sz="4" w:space="0" w:color="dee2e6"/>
+              <w:bottom w:val="single" w:sz="4" w:space="0" w:color="dee2e6"/>
+              <w:right w:val="single" w:sz="4" w:space="0" w:color="dee2e6"/>
+            </w:tcBorders>
+          </w:tcPr>
+          <w:p>
+            <w:pPr>
+              <w:jc w:val="left"/>
+            </w:pPr>
+            <w:r>
+              <w:rPr>
+                <w:b w:val="0"/>
+                <w:i w:val="0"/>
+                <w:sz w:val="16"/>
+              </w:rPr>
+              <w:t>All admin role rows</w:t>
+            </w:r>
+          </w:p>
+        </w:tc>
+        <w:tc>
+          <w:tcPr>
+            <w:tcW w:type="dxa" w:w="1247"/>
+            <w:vAlign w:val="center"/>
+            <w:shd w:val="clear" w:color="auto" w:fill="f8f9fa"/>
+            <w:tcBorders>
+              <w:top w:val="single" w:sz="4" w:space="0" w:color="dee2e6"/>
+              <w:left w:val="single" w:sz="4" w:space="0" w:color="dee2e6"/>
+              <w:bottom w:val="single" w:sz="4" w:space="0" w:color="dee2e6"/>
+              <w:right w:val="single" w:sz="4" w:space="0" w:color="dee2e6"/>
+            </w:tcBorders>
+          </w:tcPr>
+          <w:p>
+            <w:pPr>
+              <w:jc w:val="left"/>
+            </w:pPr>
+            <w:r>
+              <w:rPr>
+                <w:b w:val="0"/>
+                <w:i w:val="0"/>
+                <w:sz w:val="16"/>
+              </w:rPr>
+              <w:t>YES</w:t>
+            </w:r>
+          </w:p>
+        </w:tc>
+        <w:tc>
+          <w:tcPr>
+            <w:tcW w:type="dxa" w:w="1247"/>
+            <w:vAlign w:val="center"/>
+            <w:shd w:val="clear" w:color="auto" w:fill="f8f9fa"/>
+            <w:tcBorders>
+              <w:top w:val="single" w:sz="4" w:space="0" w:color="dee2e6"/>
+              <w:left w:val="single" w:sz="4" w:space="0" w:color="dee2e6"/>
+              <w:bottom w:val="single" w:sz="4" w:space="0" w:color="dee2e6"/>
+              <w:right w:val="single" w:sz="4" w:space="0" w:color="dee2e6"/>
+            </w:tcBorders>
+          </w:tcPr>
+          <w:p>
+            <w:pPr>
+              <w:jc w:val="left"/>
+            </w:pPr>
+            <w:r>
+              <w:rPr>
+                <w:b w:val="0"/>
+                <w:i w:val="0"/>
+                <w:sz w:val="16"/>
+              </w:rPr>
+              <w:t>YES ²</w:t>
+            </w:r>
+          </w:p>
+        </w:tc>
+        <w:tc>
+          <w:tcPr>
+            <w:tcW w:type="dxa" w:w="1134"/>
+            <w:vAlign w:val="center"/>
+            <w:shd w:val="clear" w:color="auto" w:fill="f8f9fa"/>
+            <w:tcBorders>
+              <w:top w:val="single" w:sz="4" w:space="0" w:color="dee2e6"/>
+              <w:left w:val="single" w:sz="4" w:space="0" w:color="dee2e6"/>
+              <w:bottom w:val="single" w:sz="4" w:space="0" w:color="dee2e6"/>
+              <w:right w:val="single" w:sz="4" w:space="0" w:color="dee2e6"/>
+            </w:tcBorders>
+          </w:tcPr>
+          <w:p>
+            <w:pPr>
+              <w:jc w:val="left"/>
+            </w:pPr>
+            <w:r>
+              <w:rPr>
+                <w:b w:val="0"/>
+                <w:i w:val="0"/>
+                <w:sz w:val="16"/>
+              </w:rPr>
+              <w:t>NO</w:t>
+            </w:r>
+          </w:p>
+        </w:tc>
+        <w:tc>
+          <w:tcPr>
+            <w:tcW w:type="dxa" w:w="1134"/>
+            <w:vAlign w:val="center"/>
+            <w:shd w:val="clear" w:color="auto" w:fill="f8f9fa"/>
+            <w:tcBorders>
+              <w:top w:val="single" w:sz="4" w:space="0" w:color="dee2e6"/>
+              <w:left w:val="single" w:sz="4" w:space="0" w:color="dee2e6"/>
+              <w:bottom w:val="single" w:sz="4" w:space="0" w:color="dee2e6"/>
+              <w:right w:val="single" w:sz="4" w:space="0" w:color="dee2e6"/>
+            </w:tcBorders>
+          </w:tcPr>
+          <w:p>
+            <w:pPr>
+              <w:jc w:val="left"/>
+            </w:pPr>
+            <w:r>
+              <w:rPr>
+                <w:b w:val="0"/>
+                <w:i w:val="0"/>
+                <w:sz w:val="16"/>
+              </w:rPr>
+              <w:t>NO</w:t>
+            </w:r>
+          </w:p>
+        </w:tc>
+        <w:tc>
+          <w:tcPr>
+            <w:tcW w:type="dxa" w:w="1871"/>
+            <w:vAlign w:val="center"/>
+            <w:shd w:val="clear" w:color="auto" w:fill="f8f9fa"/>
+            <w:tcBorders>
+              <w:top w:val="single" w:sz="4" w:space="0" w:color="dee2e6"/>
+              <w:left w:val="single" w:sz="4" w:space="0" w:color="dee2e6"/>
+              <w:bottom w:val="single" w:sz="4" w:space="0" w:color="dee2e6"/>
+              <w:right w:val="single" w:sz="4" w:space="0" w:color="dee2e6"/>
+            </w:tcBorders>
+          </w:tcPr>
+          <w:p>
+            <w:pPr>
+              <w:jc w:val="left"/>
+            </w:pPr>
+            <w:r>
+              <w:rPr>
+                <w:b w:val="0"/>
+                <w:i w:val="0"/>
+                <w:sz w:val="16"/>
+              </w:rPr>
+              <w:t>NO</w:t>
+            </w:r>
+          </w:p>
+        </w:tc>
+      </w:tr>
+      <w:tr>
+        <w:tc>
+          <w:tcPr>
+            <w:tcW w:type="dxa" w:w="3118"/>
+            <w:vAlign w:val="center"/>
+            <w:shd w:val="clear" w:color="auto" w:fill="FFFFFF"/>
+            <w:tcBorders>
+              <w:top w:val="single" w:sz="4" w:space="0" w:color="dee2e6"/>
+              <w:left w:val="single" w:sz="4" w:space="0" w:color="dee2e6"/>
+              <w:bottom w:val="single" w:sz="4" w:space="0" w:color="dee2e6"/>
+              <w:right w:val="single" w:sz="4" w:space="0" w:color="dee2e6"/>
+            </w:tcBorders>
+          </w:tcPr>
+          <w:p>
+            <w:pPr>
+              <w:jc w:val="left"/>
+            </w:pPr>
+            <w:r>
+              <w:rPr>
+                <w:b w:val="0"/>
+                <w:i w:val="0"/>
+                <w:sz w:val="16"/>
+              </w:rPr>
+              <w:t>All viewer role rows</w:t>
+            </w:r>
+          </w:p>
+        </w:tc>
+        <w:tc>
+          <w:tcPr>
+            <w:tcW w:type="dxa" w:w="1247"/>
+            <w:vAlign w:val="center"/>
+            <w:shd w:val="clear" w:color="auto" w:fill="FFFFFF"/>
+            <w:tcBorders>
+              <w:top w:val="single" w:sz="4" w:space="0" w:color="dee2e6"/>
+              <w:left w:val="single" w:sz="4" w:space="0" w:color="dee2e6"/>
+              <w:bottom w:val="single" w:sz="4" w:space="0" w:color="dee2e6"/>
+              <w:right w:val="single" w:sz="4" w:space="0" w:color="dee2e6"/>
+            </w:tcBorders>
+          </w:tcPr>
+          <w:p>
+            <w:pPr>
+              <w:jc w:val="left"/>
+            </w:pPr>
+            <w:r>
+              <w:rPr>
+                <w:b w:val="0"/>
+                <w:i w:val="0"/>
+                <w:sz w:val="16"/>
+              </w:rPr>
+              <w:t>YES</w:t>
+            </w:r>
+          </w:p>
+        </w:tc>
+        <w:tc>
+          <w:tcPr>
+            <w:tcW w:type="dxa" w:w="1247"/>
+            <w:vAlign w:val="center"/>
+            <w:shd w:val="clear" w:color="auto" w:fill="FFFFFF"/>
+            <w:tcBorders>
+              <w:top w:val="single" w:sz="4" w:space="0" w:color="dee2e6"/>
+              <w:left w:val="single" w:sz="4" w:space="0" w:color="dee2e6"/>
+              <w:bottom w:val="single" w:sz="4" w:space="0" w:color="dee2e6"/>
+              <w:right w:val="single" w:sz="4" w:space="0" w:color="dee2e6"/>
+            </w:tcBorders>
+          </w:tcPr>
+          <w:p>
+            <w:pPr>
+              <w:jc w:val="left"/>
+            </w:pPr>
+            <w:r>
+              <w:rPr>
+                <w:b w:val="0"/>
+                <w:i w:val="0"/>
+                <w:sz w:val="16"/>
+              </w:rPr>
+              <w:t>YES</w:t>
+            </w:r>
+          </w:p>
+        </w:tc>
+        <w:tc>
+          <w:tcPr>
+            <w:tcW w:type="dxa" w:w="1134"/>
+            <w:vAlign w:val="center"/>
+            <w:shd w:val="clear" w:color="auto" w:fill="FFFFFF"/>
+            <w:tcBorders>
+              <w:top w:val="single" w:sz="4" w:space="0" w:color="dee2e6"/>
+              <w:left w:val="single" w:sz="4" w:space="0" w:color="dee2e6"/>
+              <w:bottom w:val="single" w:sz="4" w:space="0" w:color="dee2e6"/>
+              <w:right w:val="single" w:sz="4" w:space="0" w:color="dee2e6"/>
+            </w:tcBorders>
+          </w:tcPr>
+          <w:p>
+            <w:pPr>
+              <w:jc w:val="left"/>
+            </w:pPr>
+            <w:r>
+              <w:rPr>
+                <w:b w:val="0"/>
+                <w:i w:val="0"/>
+                <w:sz w:val="16"/>
+              </w:rPr>
+              <w:t>NO</w:t>
+            </w:r>
+          </w:p>
+        </w:tc>
+        <w:tc>
+          <w:tcPr>
+            <w:tcW w:type="dxa" w:w="1134"/>
+            <w:vAlign w:val="center"/>
+            <w:shd w:val="clear" w:color="auto" w:fill="FFFFFF"/>
+            <w:tcBorders>
+              <w:top w:val="single" w:sz="4" w:space="0" w:color="dee2e6"/>
+              <w:left w:val="single" w:sz="4" w:space="0" w:color="dee2e6"/>
+              <w:bottom w:val="single" w:sz="4" w:space="0" w:color="dee2e6"/>
+              <w:right w:val="single" w:sz="4" w:space="0" w:color="dee2e6"/>
+            </w:tcBorders>
+          </w:tcPr>
+          <w:p>
+            <w:pPr>
+              <w:jc w:val="left"/>
+            </w:pPr>
+            <w:r>
+              <w:rPr>
+                <w:b w:val="0"/>
+                <w:i w:val="0"/>
+                <w:sz w:val="16"/>
+              </w:rPr>
+              <w:t>NO</w:t>
+            </w:r>
+          </w:p>
+        </w:tc>
+        <w:tc>
+          <w:tcPr>
+            <w:tcW w:type="dxa" w:w="1871"/>
+            <w:vAlign w:val="center"/>
+            <w:shd w:val="clear" w:color="auto" w:fill="FFFFFF"/>
+            <w:tcBorders>
+              <w:top w:val="single" w:sz="4" w:space="0" w:color="dee2e6"/>
+              <w:left w:val="single" w:sz="4" w:space="0" w:color="dee2e6"/>
+              <w:bottom w:val="single" w:sz="4" w:space="0" w:color="dee2e6"/>
+              <w:right w:val="single" w:sz="4" w:space="0" w:color="dee2e6"/>
+            </w:tcBorders>
+          </w:tcPr>
+          <w:p>
+            <w:pPr>
+              <w:jc w:val="left"/>
+            </w:pPr>
+            <w:r>
+              <w:rPr>
+                <w:b w:val="0"/>
+                <w:i w:val="0"/>
+                <w:sz w:val="16"/>
+              </w:rPr>
+              <w:t>NO</w:t>
+            </w:r>
+          </w:p>
+        </w:tc>
+      </w:tr>
+      <w:tr>
+        <w:tc>
+          <w:tcPr>
+            <w:tcW w:type="dxa" w:w="3118"/>
+            <w:vAlign w:val="center"/>
+            <w:shd w:val="clear" w:color="auto" w:fill="f8f9fa"/>
+            <w:tcBorders>
+              <w:top w:val="single" w:sz="4" w:space="0" w:color="dee2e6"/>
+              <w:left w:val="single" w:sz="4" w:space="0" w:color="dee2e6"/>
+              <w:bottom w:val="single" w:sz="4" w:space="0" w:color="dee2e6"/>
+              <w:right w:val="single" w:sz="4" w:space="0" w:color="dee2e6"/>
+            </w:tcBorders>
+          </w:tcPr>
+          <w:p>
+            <w:pPr>
+              <w:jc w:val="left"/>
+            </w:pPr>
+            <w:r>
+              <w:rPr>
+                <w:b w:val="0"/>
+                <w:i w:val="0"/>
+                <w:sz w:val="16"/>
+              </w:rPr>
+              <w:t>All guest role rows</w:t>
+            </w:r>
+          </w:p>
+        </w:tc>
+        <w:tc>
+          <w:tcPr>
+            <w:tcW w:type="dxa" w:w="1247"/>
+            <w:vAlign w:val="center"/>
+            <w:shd w:val="clear" w:color="auto" w:fill="f8f9fa"/>
+            <w:tcBorders>
+              <w:top w:val="single" w:sz="4" w:space="0" w:color="dee2e6"/>
+              <w:left w:val="single" w:sz="4" w:space="0" w:color="dee2e6"/>
+              <w:bottom w:val="single" w:sz="4" w:space="0" w:color="dee2e6"/>
+              <w:right w:val="single" w:sz="4" w:space="0" w:color="dee2e6"/>
+            </w:tcBorders>
+          </w:tcPr>
+          <w:p>
+            <w:pPr>
+              <w:jc w:val="left"/>
+            </w:pPr>
+            <w:r>
+              <w:rPr>
+                <w:b w:val="0"/>
+                <w:i w:val="0"/>
+                <w:sz w:val="16"/>
+              </w:rPr>
+              <w:t>YES</w:t>
+            </w:r>
+          </w:p>
+        </w:tc>
+        <w:tc>
+          <w:tcPr>
+            <w:tcW w:type="dxa" w:w="1247"/>
+            <w:vAlign w:val="center"/>
+            <w:shd w:val="clear" w:color="auto" w:fill="f8f9fa"/>
+            <w:tcBorders>
+              <w:top w:val="single" w:sz="4" w:space="0" w:color="dee2e6"/>
+              <w:left w:val="single" w:sz="4" w:space="0" w:color="dee2e6"/>
+              <w:bottom w:val="single" w:sz="4" w:space="0" w:color="dee2e6"/>
+              <w:right w:val="single" w:sz="4" w:space="0" w:color="dee2e6"/>
+            </w:tcBorders>
+          </w:tcPr>
+          <w:p>
+            <w:pPr>
+              <w:jc w:val="left"/>
+            </w:pPr>
+            <w:r>
+              <w:rPr>
+                <w:b w:val="0"/>
+                <w:i w:val="0"/>
+                <w:sz w:val="16"/>
+              </w:rPr>
+              <w:t>YES</w:t>
+            </w:r>
+          </w:p>
+        </w:tc>
+        <w:tc>
+          <w:tcPr>
+            <w:tcW w:type="dxa" w:w="1134"/>
+            <w:vAlign w:val="center"/>
+            <w:shd w:val="clear" w:color="auto" w:fill="f8f9fa"/>
+            <w:tcBorders>
+              <w:top w:val="single" w:sz="4" w:space="0" w:color="dee2e6"/>
+              <w:left w:val="single" w:sz="4" w:space="0" w:color="dee2e6"/>
+              <w:bottom w:val="single" w:sz="4" w:space="0" w:color="dee2e6"/>
+              <w:right w:val="single" w:sz="4" w:space="0" w:color="dee2e6"/>
+            </w:tcBorders>
+          </w:tcPr>
+          <w:p>
+            <w:pPr>
+              <w:jc w:val="left"/>
+            </w:pPr>
+            <w:r>
+              <w:rPr>
+                <w:b w:val="0"/>
+                <w:i w:val="0"/>
+                <w:sz w:val="16"/>
+              </w:rPr>
+              <w:t>NO</w:t>
+            </w:r>
+          </w:p>
+        </w:tc>
+        <w:tc>
+          <w:tcPr>
+            <w:tcW w:type="dxa" w:w="1134"/>
+            <w:vAlign w:val="center"/>
+            <w:shd w:val="clear" w:color="auto" w:fill="f8f9fa"/>
+            <w:tcBorders>
+              <w:top w:val="single" w:sz="4" w:space="0" w:color="dee2e6"/>
+              <w:left w:val="single" w:sz="4" w:space="0" w:color="dee2e6"/>
+              <w:bottom w:val="single" w:sz="4" w:space="0" w:color="dee2e6"/>
+              <w:right w:val="single" w:sz="4" w:space="0" w:color="dee2e6"/>
+            </w:tcBorders>
+          </w:tcPr>
+          <w:p>
+            <w:pPr>
+              <w:jc w:val="left"/>
+            </w:pPr>
+            <w:r>
+              <w:rPr>
+                <w:b w:val="0"/>
+                <w:i w:val="0"/>
+                <w:sz w:val="16"/>
+              </w:rPr>
+              <w:t>NO</w:t>
+            </w:r>
+          </w:p>
+        </w:tc>
+        <w:tc>
+          <w:tcPr>
+            <w:tcW w:type="dxa" w:w="1871"/>
+            <w:vAlign w:val="center"/>
+            <w:shd w:val="clear" w:color="auto" w:fill="f8f9fa"/>
+            <w:tcBorders>
+              <w:top w:val="single" w:sz="4" w:space="0" w:color="dee2e6"/>
+              <w:left w:val="single" w:sz="4" w:space="0" w:color="dee2e6"/>
+              <w:bottom w:val="single" w:sz="4" w:space="0" w:color="dee2e6"/>
+              <w:right w:val="single" w:sz="4" w:space="0" w:color="dee2e6"/>
+            </w:tcBorders>
+          </w:tcPr>
+          <w:p>
+            <w:pPr>
+              <w:jc w:val="left"/>
+            </w:pPr>
+            <w:r>
+              <w:rPr>
+                <w:b w:val="0"/>
+                <w:i w:val="0"/>
+                <w:sz w:val="16"/>
+              </w:rPr>
+              <w:t>NO</w:t>
+            </w:r>
+          </w:p>
+        </w:tc>
+      </w:tr>
+      <w:tr>
+        <w:tc>
+          <w:tcPr>
+            <w:tcW w:type="dxa" w:w="3118"/>
+            <w:vAlign w:val="center"/>
+            <w:shd w:val="clear" w:color="auto" w:fill="FFFFFF"/>
+            <w:tcBorders>
+              <w:top w:val="single" w:sz="4" w:space="0" w:color="dee2e6"/>
+              <w:left w:val="single" w:sz="4" w:space="0" w:color="dee2e6"/>
+              <w:bottom w:val="single" w:sz="4" w:space="0" w:color="dee2e6"/>
+              <w:right w:val="single" w:sz="4" w:space="0" w:color="dee2e6"/>
+            </w:tcBorders>
+          </w:tcPr>
+          <w:p>
+            <w:pPr>
+              <w:jc w:val="left"/>
+            </w:pPr>
+            <w:r>
+              <w:rPr>
+                <w:b w:val="0"/>
+                <w:i w:val="0"/>
+                <w:sz w:val="16"/>
+              </w:rPr>
+              <w:t>global_admin role rows</w:t>
+            </w:r>
+          </w:p>
+        </w:tc>
+        <w:tc>
+          <w:tcPr>
+            <w:tcW w:type="dxa" w:w="1247"/>
+            <w:vAlign w:val="center"/>
+            <w:shd w:val="clear" w:color="auto" w:fill="FFFFFF"/>
+            <w:tcBorders>
+              <w:top w:val="single" w:sz="4" w:space="0" w:color="dee2e6"/>
+              <w:left w:val="single" w:sz="4" w:space="0" w:color="dee2e6"/>
+              <w:bottom w:val="single" w:sz="4" w:space="0" w:color="dee2e6"/>
+              <w:right w:val="single" w:sz="4" w:space="0" w:color="dee2e6"/>
+            </w:tcBorders>
+          </w:tcPr>
+          <w:p>
+            <w:pPr>
+              <w:jc w:val="left"/>
+            </w:pPr>
+            <w:r>
+              <w:rPr>
+                <w:b w:val="0"/>
+                <w:i w:val="0"/>
+                <w:sz w:val="16"/>
+              </w:rPr>
+              <w:t>YES</w:t>
+            </w:r>
+          </w:p>
+        </w:tc>
+        <w:tc>
+          <w:tcPr>
+            <w:tcW w:type="dxa" w:w="1247"/>
+            <w:vAlign w:val="center"/>
+            <w:shd w:val="clear" w:color="auto" w:fill="FFFFFF"/>
+            <w:tcBorders>
+              <w:top w:val="single" w:sz="4" w:space="0" w:color="dee2e6"/>
+              <w:left w:val="single" w:sz="4" w:space="0" w:color="dee2e6"/>
+              <w:bottom w:val="single" w:sz="4" w:space="0" w:color="dee2e6"/>
+              <w:right w:val="single" w:sz="4" w:space="0" w:color="dee2e6"/>
+            </w:tcBorders>
+          </w:tcPr>
+          <w:p>
+            <w:pPr>
+              <w:jc w:val="left"/>
+            </w:pPr>
+            <w:r>
+              <w:rPr>
+                <w:b w:val="0"/>
+                <w:i w:val="0"/>
+                <w:sz w:val="16"/>
+              </w:rPr>
+              <w:t>NO</w:t>
+            </w:r>
+          </w:p>
+        </w:tc>
+        <w:tc>
+          <w:tcPr>
+            <w:tcW w:type="dxa" w:w="1134"/>
+            <w:vAlign w:val="center"/>
+            <w:shd w:val="clear" w:color="auto" w:fill="FFFFFF"/>
+            <w:tcBorders>
+              <w:top w:val="single" w:sz="4" w:space="0" w:color="dee2e6"/>
+              <w:left w:val="single" w:sz="4" w:space="0" w:color="dee2e6"/>
+              <w:bottom w:val="single" w:sz="4" w:space="0" w:color="dee2e6"/>
+              <w:right w:val="single" w:sz="4" w:space="0" w:color="dee2e6"/>
+            </w:tcBorders>
+          </w:tcPr>
+          <w:p>
+            <w:pPr>
+              <w:jc w:val="left"/>
+            </w:pPr>
+            <w:r>
+              <w:rPr>
+                <w:b w:val="0"/>
+                <w:i w:val="0"/>
+                <w:sz w:val="16"/>
+              </w:rPr>
+              <w:t>NO</w:t>
+            </w:r>
+          </w:p>
+        </w:tc>
+        <w:tc>
+          <w:tcPr>
+            <w:tcW w:type="dxa" w:w="1134"/>
+            <w:vAlign w:val="center"/>
+            <w:shd w:val="clear" w:color="auto" w:fill="FFFFFF"/>
+            <w:tcBorders>
+              <w:top w:val="single" w:sz="4" w:space="0" w:color="dee2e6"/>
+              <w:left w:val="single" w:sz="4" w:space="0" w:color="dee2e6"/>
+              <w:bottom w:val="single" w:sz="4" w:space="0" w:color="dee2e6"/>
+              <w:right w:val="single" w:sz="4" w:space="0" w:color="dee2e6"/>
+            </w:tcBorders>
+          </w:tcPr>
+          <w:p>
+            <w:pPr>
+              <w:jc w:val="left"/>
+            </w:pPr>
+            <w:r>
+              <w:rPr>
+                <w:b w:val="0"/>
+                <w:i w:val="0"/>
+                <w:sz w:val="16"/>
+              </w:rPr>
+              <w:t>NO</w:t>
+            </w:r>
+          </w:p>
+        </w:tc>
+        <w:tc>
+          <w:tcPr>
+            <w:tcW w:type="dxa" w:w="1871"/>
+            <w:vAlign w:val="center"/>
+            <w:shd w:val="clear" w:color="auto" w:fill="FFFFFF"/>
+            <w:tcBorders>
+              <w:top w:val="single" w:sz="4" w:space="0" w:color="dee2e6"/>
+              <w:left w:val="single" w:sz="4" w:space="0" w:color="dee2e6"/>
+              <w:bottom w:val="single" w:sz="4" w:space="0" w:color="dee2e6"/>
+              <w:right w:val="single" w:sz="4" w:space="0" w:color="dee2e6"/>
+            </w:tcBorders>
+          </w:tcPr>
+          <w:p>
+            <w:pPr>
+              <w:jc w:val="left"/>
+            </w:pPr>
+            <w:r>
+              <w:rPr>
+                <w:b w:val="0"/>
+                <w:i w:val="0"/>
+                <w:sz w:val="16"/>
+              </w:rPr>
+              <w:t>NO</w:t>
+            </w:r>
+          </w:p>
+        </w:tc>
+      </w:tr>
+      <w:tr>
+        <w:tc>
+          <w:tcPr>
+            <w:tcW w:type="dxa" w:w="3118"/>
+            <w:vAlign w:val="center"/>
+            <w:shd w:val="clear" w:color="auto" w:fill="f8f9fa"/>
+            <w:tcBorders>
+              <w:top w:val="single" w:sz="4" w:space="0" w:color="dee2e6"/>
+              <w:left w:val="single" w:sz="4" w:space="0" w:color="dee2e6"/>
+              <w:bottom w:val="single" w:sz="4" w:space="0" w:color="dee2e6"/>
+              <w:right w:val="single" w:sz="4" w:space="0" w:color="dee2e6"/>
+            </w:tcBorders>
+          </w:tcPr>
+          <w:p>
+            <w:pPr>
+              <w:jc w:val="left"/>
+            </w:pPr>
+            <w:r>
+              <w:rPr>
+                <w:b w:val="0"/>
+                <w:i w:val="0"/>
+                <w:sz w:val="16"/>
+              </w:rPr>
+              <w:t>All audit_logs rows</w:t>
+            </w:r>
+          </w:p>
+        </w:tc>
+        <w:tc>
+          <w:tcPr>
+            <w:tcW w:type="dxa" w:w="1247"/>
+            <w:vAlign w:val="center"/>
+            <w:shd w:val="clear" w:color="auto" w:fill="f8f9fa"/>
+            <w:tcBorders>
+              <w:top w:val="single" w:sz="4" w:space="0" w:color="dee2e6"/>
+              <w:left w:val="single" w:sz="4" w:space="0" w:color="dee2e6"/>
+              <w:bottom w:val="single" w:sz="4" w:space="0" w:color="dee2e6"/>
+              <w:right w:val="single" w:sz="4" w:space="0" w:color="dee2e6"/>
+            </w:tcBorders>
+          </w:tcPr>
+          <w:p>
+            <w:pPr>
+              <w:jc w:val="left"/>
+            </w:pPr>
+            <w:r>
+              <w:rPr>
+                <w:b w:val="0"/>
+                <w:i w:val="0"/>
+                <w:sz w:val="16"/>
+              </w:rPr>
+              <w:t>YES</w:t>
+            </w:r>
+          </w:p>
+        </w:tc>
+        <w:tc>
+          <w:tcPr>
+            <w:tcW w:type="dxa" w:w="1247"/>
+            <w:vAlign w:val="center"/>
+            <w:shd w:val="clear" w:color="auto" w:fill="f8f9fa"/>
+            <w:tcBorders>
+              <w:top w:val="single" w:sz="4" w:space="0" w:color="dee2e6"/>
+              <w:left w:val="single" w:sz="4" w:space="0" w:color="dee2e6"/>
+              <w:bottom w:val="single" w:sz="4" w:space="0" w:color="dee2e6"/>
+              <w:right w:val="single" w:sz="4" w:space="0" w:color="dee2e6"/>
+            </w:tcBorders>
+          </w:tcPr>
+          <w:p>
+            <w:pPr>
+              <w:jc w:val="left"/>
+            </w:pPr>
+            <w:r>
+              <w:rPr>
+                <w:b w:val="0"/>
+                <w:i w:val="0"/>
+                <w:sz w:val="16"/>
+              </w:rPr>
+              <w:t>YES</w:t>
+            </w:r>
+          </w:p>
+        </w:tc>
+        <w:tc>
+          <w:tcPr>
+            <w:tcW w:type="dxa" w:w="1134"/>
+            <w:vAlign w:val="center"/>
+            <w:shd w:val="clear" w:color="auto" w:fill="f8f9fa"/>
+            <w:tcBorders>
+              <w:top w:val="single" w:sz="4" w:space="0" w:color="dee2e6"/>
+              <w:left w:val="single" w:sz="4" w:space="0" w:color="dee2e6"/>
+              <w:bottom w:val="single" w:sz="4" w:space="0" w:color="dee2e6"/>
+              <w:right w:val="single" w:sz="4" w:space="0" w:color="dee2e6"/>
+            </w:tcBorders>
+          </w:tcPr>
+          <w:p>
+            <w:pPr>
+              <w:jc w:val="left"/>
+            </w:pPr>
+            <w:r>
+              <w:rPr>
+                <w:b w:val="0"/>
+                <w:i w:val="0"/>
+                <w:sz w:val="16"/>
+              </w:rPr>
+              <w:t>NO</w:t>
+            </w:r>
+          </w:p>
+        </w:tc>
+        <w:tc>
+          <w:tcPr>
+            <w:tcW w:type="dxa" w:w="1134"/>
+            <w:vAlign w:val="center"/>
+            <w:shd w:val="clear" w:color="auto" w:fill="f8f9fa"/>
+            <w:tcBorders>
+              <w:top w:val="single" w:sz="4" w:space="0" w:color="dee2e6"/>
+              <w:left w:val="single" w:sz="4" w:space="0" w:color="dee2e6"/>
+              <w:bottom w:val="single" w:sz="4" w:space="0" w:color="dee2e6"/>
+              <w:right w:val="single" w:sz="4" w:space="0" w:color="dee2e6"/>
+            </w:tcBorders>
+          </w:tcPr>
+          <w:p>
+            <w:pPr>
+              <w:jc w:val="left"/>
+            </w:pPr>
+            <w:r>
+              <w:rPr>
+                <w:b w:val="0"/>
+                <w:i w:val="0"/>
+                <w:sz w:val="16"/>
+              </w:rPr>
+              <w:t>NO</w:t>
+            </w:r>
+          </w:p>
+        </w:tc>
+        <w:tc>
+          <w:tcPr>
+            <w:tcW w:type="dxa" w:w="1871"/>
+            <w:vAlign w:val="center"/>
+            <w:shd w:val="clear" w:color="auto" w:fill="f8f9fa"/>
+            <w:tcBorders>
+              <w:top w:val="single" w:sz="4" w:space="0" w:color="dee2e6"/>
+              <w:left w:val="single" w:sz="4" w:space="0" w:color="dee2e6"/>
+              <w:bottom w:val="single" w:sz="4" w:space="0" w:color="dee2e6"/>
+              <w:right w:val="single" w:sz="4" w:space="0" w:color="dee2e6"/>
+            </w:tcBorders>
+          </w:tcPr>
+          <w:p>
+            <w:pPr>
+              <w:jc w:val="left"/>
+            </w:pPr>
+            <w:r>
+              <w:rPr>
+                <w:b w:val="0"/>
+                <w:i w:val="0"/>
+                <w:sz w:val="16"/>
+              </w:rPr>
+              <w:t>NO</w:t>
+            </w:r>
+          </w:p>
+        </w:tc>
+      </w:tr>
+      <w:tr>
+        <w:tc>
+          <w:tcPr>
+            <w:tcW w:type="dxa" w:w="3118"/>
+            <w:vAlign w:val="center"/>
+            <w:shd w:val="clear" w:color="auto" w:fill="FFFFFF"/>
+            <w:tcBorders>
+              <w:top w:val="single" w:sz="4" w:space="0" w:color="dee2e6"/>
+              <w:left w:val="single" w:sz="4" w:space="0" w:color="dee2e6"/>
+              <w:bottom w:val="single" w:sz="4" w:space="0" w:color="dee2e6"/>
+              <w:right w:val="single" w:sz="4" w:space="0" w:color="dee2e6"/>
+            </w:tcBorders>
+          </w:tcPr>
+          <w:p>
+            <w:pPr>
+              <w:jc w:val="left"/>
+            </w:pPr>
+            <w:r>
+              <w:rPr>
+                <w:b w:val="0"/>
+                <w:i w:val="0"/>
+                <w:sz w:val="16"/>
+              </w:rPr>
+              <w:t>device_sync_logs</w:t>
+            </w:r>
+          </w:p>
+        </w:tc>
+        <w:tc>
+          <w:tcPr>
+            <w:tcW w:type="dxa" w:w="1247"/>
+            <w:vAlign w:val="center"/>
+            <w:shd w:val="clear" w:color="auto" w:fill="FFFFFF"/>
+            <w:tcBorders>
+              <w:top w:val="single" w:sz="4" w:space="0" w:color="dee2e6"/>
+              <w:left w:val="single" w:sz="4" w:space="0" w:color="dee2e6"/>
+              <w:bottom w:val="single" w:sz="4" w:space="0" w:color="dee2e6"/>
+              <w:right w:val="single" w:sz="4" w:space="0" w:color="dee2e6"/>
+            </w:tcBorders>
+          </w:tcPr>
+          <w:p>
+            <w:pPr>
+              <w:jc w:val="left"/>
+            </w:pPr>
+            <w:r>
+              <w:rPr>
+                <w:b w:val="0"/>
+                <w:i w:val="0"/>
+                <w:sz w:val="16"/>
+              </w:rPr>
+              <w:t>YES</w:t>
+            </w:r>
+          </w:p>
+        </w:tc>
+        <w:tc>
+          <w:tcPr>
+            <w:tcW w:type="dxa" w:w="1247"/>
+            <w:vAlign w:val="center"/>
+            <w:shd w:val="clear" w:color="auto" w:fill="FFFFFF"/>
+            <w:tcBorders>
+              <w:top w:val="single" w:sz="4" w:space="0" w:color="dee2e6"/>
+              <w:left w:val="single" w:sz="4" w:space="0" w:color="dee2e6"/>
+              <w:bottom w:val="single" w:sz="4" w:space="0" w:color="dee2e6"/>
+              <w:right w:val="single" w:sz="4" w:space="0" w:color="dee2e6"/>
+            </w:tcBorders>
+          </w:tcPr>
+          <w:p>
+            <w:pPr>
+              <w:jc w:val="left"/>
+            </w:pPr>
+            <w:r>
+              <w:rPr>
+                <w:b w:val="0"/>
+                <w:i w:val="0"/>
+                <w:sz w:val="16"/>
+              </w:rPr>
+              <w:t>YES</w:t>
+            </w:r>
+          </w:p>
+        </w:tc>
+        <w:tc>
+          <w:tcPr>
+            <w:tcW w:type="dxa" w:w="1134"/>
+            <w:vAlign w:val="center"/>
+            <w:shd w:val="clear" w:color="auto" w:fill="FFFFFF"/>
+            <w:tcBorders>
+              <w:top w:val="single" w:sz="4" w:space="0" w:color="dee2e6"/>
+              <w:left w:val="single" w:sz="4" w:space="0" w:color="dee2e6"/>
+              <w:bottom w:val="single" w:sz="4" w:space="0" w:color="dee2e6"/>
+              <w:right w:val="single" w:sz="4" w:space="0" w:color="dee2e6"/>
+            </w:tcBorders>
+          </w:tcPr>
+          <w:p>
+            <w:pPr>
+              <w:jc w:val="left"/>
+            </w:pPr>
+            <w:r>
+              <w:rPr>
+                <w:b w:val="0"/>
+                <w:i w:val="0"/>
+                <w:sz w:val="16"/>
+              </w:rPr>
+              <w:t>NO</w:t>
+            </w:r>
+          </w:p>
+        </w:tc>
+        <w:tc>
+          <w:tcPr>
+            <w:tcW w:type="dxa" w:w="1134"/>
+            <w:vAlign w:val="center"/>
+            <w:shd w:val="clear" w:color="auto" w:fill="FFFFFF"/>
+            <w:tcBorders>
+              <w:top w:val="single" w:sz="4" w:space="0" w:color="dee2e6"/>
+              <w:left w:val="single" w:sz="4" w:space="0" w:color="dee2e6"/>
+              <w:bottom w:val="single" w:sz="4" w:space="0" w:color="dee2e6"/>
+              <w:right w:val="single" w:sz="4" w:space="0" w:color="dee2e6"/>
+            </w:tcBorders>
+          </w:tcPr>
+          <w:p>
+            <w:pPr>
+              <w:jc w:val="left"/>
+            </w:pPr>
+            <w:r>
+              <w:rPr>
+                <w:b w:val="0"/>
+                <w:i w:val="0"/>
+                <w:sz w:val="16"/>
+              </w:rPr>
+              <w:t>NO</w:t>
+            </w:r>
+          </w:p>
+        </w:tc>
+        <w:tc>
+          <w:tcPr>
+            <w:tcW w:type="dxa" w:w="1871"/>
+            <w:vAlign w:val="center"/>
+            <w:shd w:val="clear" w:color="auto" w:fill="FFFFFF"/>
+            <w:tcBorders>
+              <w:top w:val="single" w:sz="4" w:space="0" w:color="dee2e6"/>
+              <w:left w:val="single" w:sz="4" w:space="0" w:color="dee2e6"/>
+              <w:bottom w:val="single" w:sz="4" w:space="0" w:color="dee2e6"/>
+              <w:right w:val="single" w:sz="4" w:space="0" w:color="dee2e6"/>
+            </w:tcBorders>
+          </w:tcPr>
+          <w:p>
+            <w:pPr>
+              <w:jc w:val="left"/>
+            </w:pPr>
+            <w:r>
+              <w:rPr>
+                <w:b w:val="0"/>
+                <w:i w:val="0"/>
+                <w:sz w:val="16"/>
+              </w:rPr>
+              <w:t>NO</w:t>
+            </w:r>
+          </w:p>
+        </w:tc>
+      </w:tr>
+      <w:tr>
+        <w:tc>
+          <w:tcPr>
+            <w:tcW w:type="dxa" w:w="3118"/>
+            <w:vAlign w:val="center"/>
+            <w:shd w:val="clear" w:color="auto" w:fill="f8f9fa"/>
+            <w:tcBorders>
+              <w:top w:val="single" w:sz="4" w:space="0" w:color="dee2e6"/>
+              <w:left w:val="single" w:sz="4" w:space="0" w:color="dee2e6"/>
+              <w:bottom w:val="single" w:sz="4" w:space="0" w:color="dee2e6"/>
+              <w:right w:val="single" w:sz="4" w:space="0" w:color="dee2e6"/>
+            </w:tcBorders>
+          </w:tcPr>
+          <w:p>
+            <w:pPr>
+              <w:jc w:val="left"/>
+            </w:pPr>
+            <w:r>
+              <w:rPr>
+                <w:b w:val="0"/>
+                <w:i w:val="0"/>
+                <w:sz w:val="16"/>
+              </w:rPr>
+              <w:t>device_usage_logs</w:t>
+            </w:r>
+          </w:p>
+        </w:tc>
+        <w:tc>
+          <w:tcPr>
+            <w:tcW w:type="dxa" w:w="1247"/>
+            <w:vAlign w:val="center"/>
+            <w:shd w:val="clear" w:color="auto" w:fill="f8f9fa"/>
+            <w:tcBorders>
+              <w:top w:val="single" w:sz="4" w:space="0" w:color="dee2e6"/>
+              <w:left w:val="single" w:sz="4" w:space="0" w:color="dee2e6"/>
+              <w:bottom w:val="single" w:sz="4" w:space="0" w:color="dee2e6"/>
+              <w:right w:val="single" w:sz="4" w:space="0" w:color="dee2e6"/>
+            </w:tcBorders>
+          </w:tcPr>
+          <w:p>
+            <w:pPr>
+              <w:jc w:val="left"/>
+            </w:pPr>
+            <w:r>
+              <w:rPr>
+                <w:b w:val="0"/>
+                <w:i w:val="0"/>
+                <w:sz w:val="16"/>
+              </w:rPr>
+              <w:t>YES</w:t>
+            </w:r>
+          </w:p>
+        </w:tc>
+        <w:tc>
+          <w:tcPr>
+            <w:tcW w:type="dxa" w:w="1247"/>
+            <w:vAlign w:val="center"/>
+            <w:shd w:val="clear" w:color="auto" w:fill="f8f9fa"/>
+            <w:tcBorders>
+              <w:top w:val="single" w:sz="4" w:space="0" w:color="dee2e6"/>
+              <w:left w:val="single" w:sz="4" w:space="0" w:color="dee2e6"/>
+              <w:bottom w:val="single" w:sz="4" w:space="0" w:color="dee2e6"/>
+              <w:right w:val="single" w:sz="4" w:space="0" w:color="dee2e6"/>
+            </w:tcBorders>
+          </w:tcPr>
+          <w:p>
+            <w:pPr>
+              <w:jc w:val="left"/>
+            </w:pPr>
+            <w:r>
+              <w:rPr>
+                <w:b w:val="0"/>
+                <w:i w:val="0"/>
+                <w:sz w:val="16"/>
+              </w:rPr>
+              <w:t>YES</w:t>
+            </w:r>
+          </w:p>
+        </w:tc>
+        <w:tc>
+          <w:tcPr>
+            <w:tcW w:type="dxa" w:w="1134"/>
+            <w:vAlign w:val="center"/>
+            <w:shd w:val="clear" w:color="auto" w:fill="f8f9fa"/>
+            <w:tcBorders>
+              <w:top w:val="single" w:sz="4" w:space="0" w:color="dee2e6"/>
+              <w:left w:val="single" w:sz="4" w:space="0" w:color="dee2e6"/>
+              <w:bottom w:val="single" w:sz="4" w:space="0" w:color="dee2e6"/>
+              <w:right w:val="single" w:sz="4" w:space="0" w:color="dee2e6"/>
+            </w:tcBorders>
+          </w:tcPr>
+          <w:p>
+            <w:pPr>
+              <w:jc w:val="left"/>
+            </w:pPr>
+            <w:r>
+              <w:rPr>
+                <w:b w:val="0"/>
+                <w:i w:val="0"/>
+                <w:sz w:val="16"/>
+              </w:rPr>
+              <w:t>NO</w:t>
+            </w:r>
+          </w:p>
+        </w:tc>
+        <w:tc>
+          <w:tcPr>
+            <w:tcW w:type="dxa" w:w="1134"/>
+            <w:vAlign w:val="center"/>
+            <w:shd w:val="clear" w:color="auto" w:fill="f8f9fa"/>
+            <w:tcBorders>
+              <w:top w:val="single" w:sz="4" w:space="0" w:color="dee2e6"/>
+              <w:left w:val="single" w:sz="4" w:space="0" w:color="dee2e6"/>
+              <w:bottom w:val="single" w:sz="4" w:space="0" w:color="dee2e6"/>
+              <w:right w:val="single" w:sz="4" w:space="0" w:color="dee2e6"/>
+            </w:tcBorders>
+          </w:tcPr>
+          <w:p>
+            <w:pPr>
+              <w:jc w:val="left"/>
+            </w:pPr>
+            <w:r>
+              <w:rPr>
+                <w:b w:val="0"/>
+                <w:i w:val="0"/>
+                <w:sz w:val="16"/>
+              </w:rPr>
+              <w:t>NO</w:t>
+            </w:r>
+          </w:p>
+        </w:tc>
+        <w:tc>
+          <w:tcPr>
+            <w:tcW w:type="dxa" w:w="1871"/>
+            <w:vAlign w:val="center"/>
+            <w:shd w:val="clear" w:color="auto" w:fill="f8f9fa"/>
+            <w:tcBorders>
+              <w:top w:val="single" w:sz="4" w:space="0" w:color="dee2e6"/>
+              <w:left w:val="single" w:sz="4" w:space="0" w:color="dee2e6"/>
+              <w:bottom w:val="single" w:sz="4" w:space="0" w:color="dee2e6"/>
+              <w:right w:val="single" w:sz="4" w:space="0" w:color="dee2e6"/>
+            </w:tcBorders>
+          </w:tcPr>
+          <w:p>
+            <w:pPr>
+              <w:jc w:val="left"/>
+            </w:pPr>
+            <w:r>
+              <w:rPr>
+                <w:b w:val="0"/>
+                <w:i w:val="0"/>
+                <w:sz w:val="16"/>
+              </w:rPr>
+              <w:t>NO</w:t>
+            </w:r>
+          </w:p>
+        </w:tc>
+      </w:tr>
+    </w:tbl>
+    <w:p/>
+    <w:p>
+      <w:pPr>
+        <w:spacing w:after="120"/>
+      </w:pPr>
+      <w:r>
+        <w:t>¹ Guest DB-level access (intentional design): The RLS policy 'Users see own' evaluates user_id = auth.uid() for ALL authenticated users — there is no role restriction in the policy condition. Guest users CAN read their own auth_audit and audit_logs rows directly via the Supabase SDK or API. The /activity frontend page is blocked by the route guard (UX/product decision), not by RLS. This is an intentional permissive-at-DB, restricted-at-UI design.</w:t>
+      </w:r>
+    </w:p>
+    <w:p>
+      <w:pPr>
+        <w:spacing w:after="120"/>
+      </w:pPr>
+      <w:r>
+        <w:t>² Cross-admin visibility (intentional by design): An admin can read the full audit trail of OTHER admins within the same tenant. The RLS condition role IN ('admin','user','viewer','guest') includes all admin rows. This is deliberate — it ensures accountability: any admin action is visible to peer admins and to global_admin. This is NOT a privilege escalation: admins cannot see global_admin rows, and no UPDATE/DELETE policy exists so audit rows are immutable to all roles.</w:t>
       </w:r>
     </w:p>
     <w:p>
@@ -4637,7 +6589,7 @@
         <w:jc w:val="left"/>
       </w:pPr>
       <w:r>
-        <w:t>ATNA Code Reference</w:t>
+        <w:t>ATNA Action Code Reference</w:t>
       </w:r>
     </w:p>
     <w:tbl>
@@ -4648,41 +6600,15 @@
         <w:tblLook w:firstColumn="1" w:firstRow="1" w:lastColumn="0" w:lastRow="0" w:noHBand="0" w:noVBand="1" w:val="04A0"/>
       </w:tblPr>
       <w:tblGrid>
-        <w:gridCol w:w="3135"/>
-        <w:gridCol w:w="3135"/>
-        <w:gridCol w:w="3135"/>
+        <w:gridCol w:w="2351"/>
+        <w:gridCol w:w="2351"/>
+        <w:gridCol w:w="2351"/>
+        <w:gridCol w:w="2351"/>
       </w:tblGrid>
       <w:tr>
         <w:tc>
           <w:tcPr>
-            <w:tcW w:type="dxa" w:w="1984"/>
-            <w:vAlign w:val="center"/>
-            <w:shd w:val="clear" w:color="auto" w:fill="1a1a2e"/>
-            <w:tcBorders>
-              <w:top w:val="single" w:sz="4" w:space="0" w:color="dee2e6"/>
-              <w:left w:val="single" w:sz="4" w:space="0" w:color="dee2e6"/>
-              <w:bottom w:val="single" w:sz="4" w:space="0" w:color="dee2e6"/>
-              <w:right w:val="single" w:sz="4" w:space="0" w:color="dee2e6"/>
-            </w:tcBorders>
-          </w:tcPr>
-          <w:p>
-            <w:pPr>
-              <w:jc w:val="left"/>
-            </w:pPr>
-            <w:r>
-              <w:rPr>
-                <w:b/>
-                <w:i w:val="0"/>
-                <w:color w:val="FFFFFF"/>
-                <w:sz w:val="16"/>
-              </w:rPr>
-              <w:t>Code Type</w:t>
-            </w:r>
-          </w:p>
-        </w:tc>
-        <w:tc>
-          <w:tcPr>
-            <w:tcW w:type="dxa" w:w="1134"/>
+            <w:tcW w:type="dxa" w:w="850"/>
             <w:vAlign w:val="center"/>
             <w:shd w:val="clear" w:color="auto" w:fill="1a1a2e"/>
             <w:tcBorders>
@@ -4709,7 +6635,7 @@
         </w:tc>
         <w:tc>
           <w:tcPr>
-            <w:tcW w:type="dxa" w:w="6803"/>
+            <w:tcW w:type="dxa" w:w="1417"/>
             <w:vAlign w:val="center"/>
             <w:shd w:val="clear" w:color="auto" w:fill="1a1a2e"/>
             <w:tcBorders>
@@ -4734,13 +6660,11 @@
             </w:r>
           </w:p>
         </w:tc>
-      </w:tr>
-      <w:tr>
         <w:tc>
           <w:tcPr>
-            <w:tcW w:type="dxa" w:w="1984"/>
+            <w:tcW w:type="dxa" w:w="2551"/>
             <w:vAlign w:val="center"/>
-            <w:shd w:val="clear" w:color="auto" w:fill="f8f9fa"/>
+            <w:shd w:val="clear" w:color="auto" w:fill="1a1a2e"/>
             <w:tcBorders>
               <w:top w:val="single" w:sz="4" w:space="0" w:color="dee2e6"/>
               <w:left w:val="single" w:sz="4" w:space="0" w:color="dee2e6"/>
@@ -4754,17 +6678,47 @@
             </w:pPr>
             <w:r>
               <w:rPr>
-                <w:b w:val="0"/>
+                <w:b/>
                 <w:i w:val="0"/>
+                <w:color w:val="FFFFFF"/>
                 <w:sz w:val="16"/>
               </w:rPr>
-              <w:t>Action</w:t>
+              <w:t>Status</w:t>
             </w:r>
           </w:p>
         </w:tc>
         <w:tc>
           <w:tcPr>
-            <w:tcW w:type="dxa" w:w="1134"/>
+            <w:tcW w:type="dxa" w:w="4819"/>
+            <w:vAlign w:val="center"/>
+            <w:shd w:val="clear" w:color="auto" w:fill="1a1a2e"/>
+            <w:tcBorders>
+              <w:top w:val="single" w:sz="4" w:space="0" w:color="dee2e6"/>
+              <w:left w:val="single" w:sz="4" w:space="0" w:color="dee2e6"/>
+              <w:bottom w:val="single" w:sz="4" w:space="0" w:color="dee2e6"/>
+              <w:right w:val="single" w:sz="4" w:space="0" w:color="dee2e6"/>
+            </w:tcBorders>
+          </w:tcPr>
+          <w:p>
+            <w:pPr>
+              <w:jc w:val="left"/>
+            </w:pPr>
+            <w:r>
+              <w:rPr>
+                <w:b/>
+                <w:i w:val="0"/>
+                <w:color w:val="FFFFFF"/>
+                <w:sz w:val="16"/>
+              </w:rPr>
+              <w:t>Used By</w:t>
+            </w:r>
+          </w:p>
+        </w:tc>
+      </w:tr>
+      <w:tr>
+        <w:tc>
+          <w:tcPr>
+            <w:tcW w:type="dxa" w:w="850"/>
             <w:vAlign w:val="center"/>
             <w:shd w:val="clear" w:color="auto" w:fill="f8f9fa"/>
             <w:tcBorders>
@@ -4790,7 +6744,7 @@
         </w:tc>
         <w:tc>
           <w:tcPr>
-            <w:tcW w:type="dxa" w:w="6803"/>
+            <w:tcW w:type="dxa" w:w="1417"/>
             <w:vAlign w:val="center"/>
             <w:shd w:val="clear" w:color="auto" w:fill="f8f9fa"/>
             <w:tcBorders>
@@ -4814,13 +6768,11 @@
             </w:r>
           </w:p>
         </w:tc>
-      </w:tr>
-      <w:tr>
         <w:tc>
           <w:tcPr>
-            <w:tcW w:type="dxa" w:w="1984"/>
+            <w:tcW w:type="dxa" w:w="2551"/>
             <w:vAlign w:val="center"/>
-            <w:shd w:val="clear" w:color="auto" w:fill="FFFFFF"/>
+            <w:shd w:val="clear" w:color="auto" w:fill="f8f9fa"/>
             <w:tcBorders>
               <w:top w:val="single" w:sz="4" w:space="0" w:color="dee2e6"/>
               <w:left w:val="single" w:sz="4" w:space="0" w:color="dee2e6"/>
@@ -4838,13 +6790,41 @@
                 <w:i w:val="0"/>
                 <w:sz w:val="16"/>
               </w:rPr>
-              <w:t>Action</w:t>
+              <w:t>Planned — no events assigned yet</w:t>
             </w:r>
           </w:p>
         </w:tc>
         <w:tc>
           <w:tcPr>
-            <w:tcW w:type="dxa" w:w="1134"/>
+            <w:tcW w:type="dxa" w:w="4819"/>
+            <w:vAlign w:val="center"/>
+            <w:shd w:val="clear" w:color="auto" w:fill="f8f9fa"/>
+            <w:tcBorders>
+              <w:top w:val="single" w:sz="4" w:space="0" w:color="dee2e6"/>
+              <w:left w:val="single" w:sz="4" w:space="0" w:color="dee2e6"/>
+              <w:bottom w:val="single" w:sz="4" w:space="0" w:color="dee2e6"/>
+              <w:right w:val="single" w:sz="4" w:space="0" w:color="dee2e6"/>
+            </w:tcBorders>
+          </w:tcPr>
+          <w:p>
+            <w:pPr>
+              <w:jc w:val="left"/>
+            </w:pPr>
+            <w:r>
+              <w:rPr>
+                <w:b w:val="0"/>
+                <w:i w:val="0"/>
+                <w:sz w:val="16"/>
+              </w:rPr>
+              <w:t>Reserved for future: e.g. user creation events</w:t>
+            </w:r>
+          </w:p>
+        </w:tc>
+      </w:tr>
+      <w:tr>
+        <w:tc>
+          <w:tcPr>
+            <w:tcW w:type="dxa" w:w="850"/>
             <w:vAlign w:val="center"/>
             <w:shd w:val="clear" w:color="auto" w:fill="FFFFFF"/>
             <w:tcBorders>
@@ -4870,7 +6850,7 @@
         </w:tc>
         <w:tc>
           <w:tcPr>
-            <w:tcW w:type="dxa" w:w="6803"/>
+            <w:tcW w:type="dxa" w:w="1417"/>
             <w:vAlign w:val="center"/>
             <w:shd w:val="clear" w:color="auto" w:fill="FFFFFF"/>
             <w:tcBorders>
@@ -4894,13 +6874,11 @@
             </w:r>
           </w:p>
         </w:tc>
-      </w:tr>
-      <w:tr>
         <w:tc>
           <w:tcPr>
-            <w:tcW w:type="dxa" w:w="1984"/>
+            <w:tcW w:type="dxa" w:w="2551"/>
             <w:vAlign w:val="center"/>
-            <w:shd w:val="clear" w:color="auto" w:fill="f8f9fa"/>
+            <w:shd w:val="clear" w:color="auto" w:fill="FFFFFF"/>
             <w:tcBorders>
               <w:top w:val="single" w:sz="4" w:space="0" w:color="dee2e6"/>
               <w:left w:val="single" w:sz="4" w:space="0" w:color="dee2e6"/>
@@ -4918,13 +6896,41 @@
                 <w:i w:val="0"/>
                 <w:sz w:val="16"/>
               </w:rPr>
-              <w:t>Action</w:t>
+              <w:t>Planned — no events assigned yet</w:t>
             </w:r>
           </w:p>
         </w:tc>
         <w:tc>
           <w:tcPr>
-            <w:tcW w:type="dxa" w:w="1134"/>
+            <w:tcW w:type="dxa" w:w="4819"/>
+            <w:vAlign w:val="center"/>
+            <w:shd w:val="clear" w:color="auto" w:fill="FFFFFF"/>
+            <w:tcBorders>
+              <w:top w:val="single" w:sz="4" w:space="0" w:color="dee2e6"/>
+              <w:left w:val="single" w:sz="4" w:space="0" w:color="dee2e6"/>
+              <w:bottom w:val="single" w:sz="4" w:space="0" w:color="dee2e6"/>
+              <w:right w:val="single" w:sz="4" w:space="0" w:color="dee2e6"/>
+            </w:tcBorders>
+          </w:tcPr>
+          <w:p>
+            <w:pPr>
+              <w:jc w:val="left"/>
+            </w:pPr>
+            <w:r>
+              <w:rPr>
+                <w:b w:val="0"/>
+                <w:i w:val="0"/>
+                <w:sz w:val="16"/>
+              </w:rPr>
+              <w:t>Reserved for future: e.g. document view events</w:t>
+            </w:r>
+          </w:p>
+        </w:tc>
+      </w:tr>
+      <w:tr>
+        <w:tc>
+          <w:tcPr>
+            <w:tcW w:type="dxa" w:w="850"/>
             <w:vAlign w:val="center"/>
             <w:shd w:val="clear" w:color="auto" w:fill="f8f9fa"/>
             <w:tcBorders>
@@ -4950,7 +6956,7 @@
         </w:tc>
         <w:tc>
           <w:tcPr>
-            <w:tcW w:type="dxa" w:w="6803"/>
+            <w:tcW w:type="dxa" w:w="1417"/>
             <w:vAlign w:val="center"/>
             <w:shd w:val="clear" w:color="auto" w:fill="f8f9fa"/>
             <w:tcBorders>
@@ -4974,13 +6980,11 @@
             </w:r>
           </w:p>
         </w:tc>
-      </w:tr>
-      <w:tr>
         <w:tc>
           <w:tcPr>
-            <w:tcW w:type="dxa" w:w="1984"/>
+            <w:tcW w:type="dxa" w:w="2551"/>
             <w:vAlign w:val="center"/>
-            <w:shd w:val="clear" w:color="auto" w:fill="FFFFFF"/>
+            <w:shd w:val="clear" w:color="auto" w:fill="f8f9fa"/>
             <w:tcBorders>
               <w:top w:val="single" w:sz="4" w:space="0" w:color="dee2e6"/>
               <w:left w:val="single" w:sz="4" w:space="0" w:color="dee2e6"/>
@@ -4998,13 +7002,41 @@
                 <w:i w:val="0"/>
                 <w:sz w:val="16"/>
               </w:rPr>
-              <w:t>Action</w:t>
+              <w:t>Active</w:t>
             </w:r>
           </w:p>
         </w:tc>
         <w:tc>
           <w:tcPr>
-            <w:tcW w:type="dxa" w:w="1134"/>
+            <w:tcW w:type="dxa" w:w="4819"/>
+            <w:vAlign w:val="center"/>
+            <w:shd w:val="clear" w:color="auto" w:fill="f8f9fa"/>
+            <w:tcBorders>
+              <w:top w:val="single" w:sz="4" w:space="0" w:color="dee2e6"/>
+              <w:left w:val="single" w:sz="4" w:space="0" w:color="dee2e6"/>
+              <w:bottom w:val="single" w:sz="4" w:space="0" w:color="dee2e6"/>
+              <w:right w:val="single" w:sz="4" w:space="0" w:color="dee2e6"/>
+            </w:tcBorders>
+          </w:tcPr>
+          <w:p>
+            <w:pPr>
+              <w:jc w:val="left"/>
+            </w:pPr>
+            <w:r>
+              <w:rPr>
+                <w:b w:val="0"/>
+                <w:i w:val="0"/>
+                <w:sz w:val="16"/>
+              </w:rPr>
+              <w:t>approve_pod:{model_id}, reject_pod:{model_id}</w:t>
+            </w:r>
+          </w:p>
+        </w:tc>
+      </w:tr>
+      <w:tr>
+        <w:tc>
+          <w:tcPr>
+            <w:tcW w:type="dxa" w:w="850"/>
             <w:vAlign w:val="center"/>
             <w:shd w:val="clear" w:color="auto" w:fill="FFFFFF"/>
             <w:tcBorders>
@@ -5030,7 +7062,7 @@
         </w:tc>
         <w:tc>
           <w:tcPr>
-            <w:tcW w:type="dxa" w:w="6803"/>
+            <w:tcW w:type="dxa" w:w="1417"/>
             <w:vAlign w:val="center"/>
             <w:shd w:val="clear" w:color="auto" w:fill="FFFFFF"/>
             <w:tcBorders>
@@ -5054,13 +7086,11 @@
             </w:r>
           </w:p>
         </w:tc>
-      </w:tr>
-      <w:tr>
         <w:tc>
           <w:tcPr>
-            <w:tcW w:type="dxa" w:w="1984"/>
+            <w:tcW w:type="dxa" w:w="2551"/>
             <w:vAlign w:val="center"/>
-            <w:shd w:val="clear" w:color="auto" w:fill="f8f9fa"/>
+            <w:shd w:val="clear" w:color="auto" w:fill="FFFFFF"/>
             <w:tcBorders>
               <w:top w:val="single" w:sz="4" w:space="0" w:color="dee2e6"/>
               <w:left w:val="single" w:sz="4" w:space="0" w:color="dee2e6"/>
@@ -5078,13 +7108,41 @@
                 <w:i w:val="0"/>
                 <w:sz w:val="16"/>
               </w:rPr>
-              <w:t>Action</w:t>
+              <w:t>Planned — no events assigned yet</w:t>
             </w:r>
           </w:p>
         </w:tc>
         <w:tc>
           <w:tcPr>
-            <w:tcW w:type="dxa" w:w="1134"/>
+            <w:tcW w:type="dxa" w:w="4819"/>
+            <w:vAlign w:val="center"/>
+            <w:shd w:val="clear" w:color="auto" w:fill="FFFFFF"/>
+            <w:tcBorders>
+              <w:top w:val="single" w:sz="4" w:space="0" w:color="dee2e6"/>
+              <w:left w:val="single" w:sz="4" w:space="0" w:color="dee2e6"/>
+              <w:bottom w:val="single" w:sz="4" w:space="0" w:color="dee2e6"/>
+              <w:right w:val="single" w:sz="4" w:space="0" w:color="dee2e6"/>
+            </w:tcBorders>
+          </w:tcPr>
+          <w:p>
+            <w:pPr>
+              <w:jc w:val="left"/>
+            </w:pPr>
+            <w:r>
+              <w:rPr>
+                <w:b w:val="0"/>
+                <w:i w:val="0"/>
+                <w:sz w:val="16"/>
+              </w:rPr>
+              <w:t>Reserved for future: e.g. record deletion events</w:t>
+            </w:r>
+          </w:p>
+        </w:tc>
+      </w:tr>
+      <w:tr>
+        <w:tc>
+          <w:tcPr>
+            <w:tcW w:type="dxa" w:w="850"/>
             <w:vAlign w:val="center"/>
             <w:shd w:val="clear" w:color="auto" w:fill="f8f9fa"/>
             <w:tcBorders>
@@ -5110,7 +7168,7 @@
         </w:tc>
         <w:tc>
           <w:tcPr>
-            <w:tcW w:type="dxa" w:w="6803"/>
+            <w:tcW w:type="dxa" w:w="1417"/>
             <w:vAlign w:val="center"/>
             <w:shd w:val="clear" w:color="auto" w:fill="f8f9fa"/>
             <w:tcBorders>
@@ -5134,8 +7192,280 @@
             </w:r>
           </w:p>
         </w:tc>
+        <w:tc>
+          <w:tcPr>
+            <w:tcW w:type="dxa" w:w="2551"/>
+            <w:vAlign w:val="center"/>
+            <w:shd w:val="clear" w:color="auto" w:fill="f8f9fa"/>
+            <w:tcBorders>
+              <w:top w:val="single" w:sz="4" w:space="0" w:color="dee2e6"/>
+              <w:left w:val="single" w:sz="4" w:space="0" w:color="dee2e6"/>
+              <w:bottom w:val="single" w:sz="4" w:space="0" w:color="dee2e6"/>
+              <w:right w:val="single" w:sz="4" w:space="0" w:color="dee2e6"/>
+            </w:tcBorders>
+          </w:tcPr>
+          <w:p>
+            <w:pPr>
+              <w:jc w:val="left"/>
+            </w:pPr>
+            <w:r>
+              <w:rPr>
+                <w:b w:val="0"/>
+                <w:i w:val="0"/>
+                <w:sz w:val="16"/>
+              </w:rPr>
+              <w:t>Active</w:t>
+            </w:r>
+          </w:p>
+        </w:tc>
+        <w:tc>
+          <w:tcPr>
+            <w:tcW w:type="dxa" w:w="4819"/>
+            <w:vAlign w:val="center"/>
+            <w:shd w:val="clear" w:color="auto" w:fill="f8f9fa"/>
+            <w:tcBorders>
+              <w:top w:val="single" w:sz="4" w:space="0" w:color="dee2e6"/>
+              <w:left w:val="single" w:sz="4" w:space="0" w:color="dee2e6"/>
+              <w:bottom w:val="single" w:sz="4" w:space="0" w:color="dee2e6"/>
+              <w:right w:val="single" w:sz="4" w:space="0" w:color="dee2e6"/>
+            </w:tcBorders>
+          </w:tcPr>
+          <w:p>
+            <w:pPr>
+              <w:jc w:val="left"/>
+            </w:pPr>
+            <w:r>
+              <w:rPr>
+                <w:b w:val="0"/>
+                <w:i w:val="0"/>
+                <w:sz w:val="16"/>
+              </w:rPr>
+              <w:t>login, login_failed, logout</w:t>
+            </w:r>
+          </w:p>
+        </w:tc>
+      </w:tr>
+    </w:tbl>
+    <w:p/>
+    <w:p>
+      <w:pPr>
+        <w:spacing w:after="120"/>
+      </w:pPr>
+      <w:r>
+        <w:t>Note: Codes C, R, and D are defined per the ATNA standard and reserved for future use. They are marked 'Planned' to signal no current event uses them — a reader should not expect to find live rows with these codes.</w:t>
+      </w:r>
+    </w:p>
+    <w:p>
+      <w:pPr>
+        <w:pStyle w:val="Heading2"/>
+        <w:jc w:val="left"/>
+      </w:pPr>
+      <w:r>
+        <w:t>ATNA Outcome Code Reference</w:t>
+      </w:r>
+    </w:p>
+    <w:tbl>
+      <w:tblPr>
+        <w:tblStyle w:val="TableGrid"/>
+        <w:tblW w:type="auto" w:w="0"/>
+        <w:jc w:val="left"/>
+        <w:tblLook w:firstColumn="1" w:firstRow="1" w:lastColumn="0" w:lastRow="0" w:noHBand="0" w:noVBand="1" w:val="04A0"/>
+      </w:tblPr>
+      <w:tblGrid>
+        <w:gridCol w:w="3135"/>
+        <w:gridCol w:w="3135"/>
+        <w:gridCol w:w="3135"/>
+      </w:tblGrid>
+      <w:tr>
+        <w:tc>
+          <w:tcPr>
+            <w:tcW w:type="dxa" w:w="850"/>
+            <w:vAlign w:val="center"/>
+            <w:shd w:val="clear" w:color="auto" w:fill="1a1a2e"/>
+            <w:tcBorders>
+              <w:top w:val="single" w:sz="4" w:space="0" w:color="dee2e6"/>
+              <w:left w:val="single" w:sz="4" w:space="0" w:color="dee2e6"/>
+              <w:bottom w:val="single" w:sz="4" w:space="0" w:color="dee2e6"/>
+              <w:right w:val="single" w:sz="4" w:space="0" w:color="dee2e6"/>
+            </w:tcBorders>
+          </w:tcPr>
+          <w:p>
+            <w:pPr>
+              <w:jc w:val="left"/>
+            </w:pPr>
+            <w:r>
+              <w:rPr>
+                <w:b/>
+                <w:i w:val="0"/>
+                <w:color w:val="FFFFFF"/>
+                <w:sz w:val="16"/>
+              </w:rPr>
+              <w:t>Code</w:t>
+            </w:r>
+          </w:p>
+        </w:tc>
+        <w:tc>
+          <w:tcPr>
+            <w:tcW w:type="dxa" w:w="1984"/>
+            <w:vAlign w:val="center"/>
+            <w:shd w:val="clear" w:color="auto" w:fill="1a1a2e"/>
+            <w:tcBorders>
+              <w:top w:val="single" w:sz="4" w:space="0" w:color="dee2e6"/>
+              <w:left w:val="single" w:sz="4" w:space="0" w:color="dee2e6"/>
+              <w:bottom w:val="single" w:sz="4" w:space="0" w:color="dee2e6"/>
+              <w:right w:val="single" w:sz="4" w:space="0" w:color="dee2e6"/>
+            </w:tcBorders>
+          </w:tcPr>
+          <w:p>
+            <w:pPr>
+              <w:jc w:val="left"/>
+            </w:pPr>
+            <w:r>
+              <w:rPr>
+                <w:b/>
+                <w:i w:val="0"/>
+                <w:color w:val="FFFFFF"/>
+                <w:sz w:val="16"/>
+              </w:rPr>
+              <w:t>Meaning</w:t>
+            </w:r>
+          </w:p>
+        </w:tc>
+        <w:tc>
+          <w:tcPr>
+            <w:tcW w:type="dxa" w:w="6803"/>
+            <w:vAlign w:val="center"/>
+            <w:shd w:val="clear" w:color="auto" w:fill="1a1a2e"/>
+            <w:tcBorders>
+              <w:top w:val="single" w:sz="4" w:space="0" w:color="dee2e6"/>
+              <w:left w:val="single" w:sz="4" w:space="0" w:color="dee2e6"/>
+              <w:bottom w:val="single" w:sz="4" w:space="0" w:color="dee2e6"/>
+              <w:right w:val="single" w:sz="4" w:space="0" w:color="dee2e6"/>
+            </w:tcBorders>
+          </w:tcPr>
+          <w:p>
+            <w:pPr>
+              <w:jc w:val="left"/>
+            </w:pPr>
+            <w:r>
+              <w:rPr>
+                <w:b/>
+                <w:i w:val="0"/>
+                <w:color w:val="FFFFFF"/>
+                <w:sz w:val="16"/>
+              </w:rPr>
+              <w:t>Severity</w:t>
+            </w:r>
+          </w:p>
+        </w:tc>
       </w:tr>
       <w:tr>
+        <w:tc>
+          <w:tcPr>
+            <w:tcW w:type="dxa" w:w="850"/>
+            <w:vAlign w:val="center"/>
+            <w:shd w:val="clear" w:color="auto" w:fill="f8f9fa"/>
+            <w:tcBorders>
+              <w:top w:val="single" w:sz="4" w:space="0" w:color="dee2e6"/>
+              <w:left w:val="single" w:sz="4" w:space="0" w:color="dee2e6"/>
+              <w:bottom w:val="single" w:sz="4" w:space="0" w:color="dee2e6"/>
+              <w:right w:val="single" w:sz="4" w:space="0" w:color="dee2e6"/>
+            </w:tcBorders>
+          </w:tcPr>
+          <w:p>
+            <w:pPr>
+              <w:jc w:val="left"/>
+            </w:pPr>
+            <w:r>
+              <w:rPr>
+                <w:b w:val="0"/>
+                <w:i w:val="0"/>
+                <w:sz w:val="16"/>
+              </w:rPr>
+              <w:t>0</w:t>
+            </w:r>
+          </w:p>
+        </w:tc>
+        <w:tc>
+          <w:tcPr>
+            <w:tcW w:type="dxa" w:w="1984"/>
+            <w:vAlign w:val="center"/>
+            <w:shd w:val="clear" w:color="auto" w:fill="f8f9fa"/>
+            <w:tcBorders>
+              <w:top w:val="single" w:sz="4" w:space="0" w:color="dee2e6"/>
+              <w:left w:val="single" w:sz="4" w:space="0" w:color="dee2e6"/>
+              <w:bottom w:val="single" w:sz="4" w:space="0" w:color="dee2e6"/>
+              <w:right w:val="single" w:sz="4" w:space="0" w:color="dee2e6"/>
+            </w:tcBorders>
+          </w:tcPr>
+          <w:p>
+            <w:pPr>
+              <w:jc w:val="left"/>
+            </w:pPr>
+            <w:r>
+              <w:rPr>
+                <w:b w:val="0"/>
+                <w:i w:val="0"/>
+                <w:sz w:val="16"/>
+              </w:rPr>
+              <w:t>Success</w:t>
+            </w:r>
+          </w:p>
+        </w:tc>
+        <w:tc>
+          <w:tcPr>
+            <w:tcW w:type="dxa" w:w="6803"/>
+            <w:vAlign w:val="center"/>
+            <w:shd w:val="clear" w:color="auto" w:fill="f8f9fa"/>
+            <w:tcBorders>
+              <w:top w:val="single" w:sz="4" w:space="0" w:color="dee2e6"/>
+              <w:left w:val="single" w:sz="4" w:space="0" w:color="dee2e6"/>
+              <w:bottom w:val="single" w:sz="4" w:space="0" w:color="dee2e6"/>
+              <w:right w:val="single" w:sz="4" w:space="0" w:color="dee2e6"/>
+            </w:tcBorders>
+          </w:tcPr>
+          <w:p>
+            <w:pPr>
+              <w:jc w:val="left"/>
+            </w:pPr>
+            <w:r>
+              <w:rPr>
+                <w:b w:val="0"/>
+                <w:i w:val="0"/>
+                <w:sz w:val="16"/>
+              </w:rPr>
+              <w:t>None — operation completed normally</w:t>
+            </w:r>
+          </w:p>
+        </w:tc>
+      </w:tr>
+      <w:tr>
+        <w:tc>
+          <w:tcPr>
+            <w:tcW w:type="dxa" w:w="850"/>
+            <w:vAlign w:val="center"/>
+            <w:shd w:val="clear" w:color="auto" w:fill="FFFFFF"/>
+            <w:tcBorders>
+              <w:top w:val="single" w:sz="4" w:space="0" w:color="dee2e6"/>
+              <w:left w:val="single" w:sz="4" w:space="0" w:color="dee2e6"/>
+              <w:bottom w:val="single" w:sz="4" w:space="0" w:color="dee2e6"/>
+              <w:right w:val="single" w:sz="4" w:space="0" w:color="dee2e6"/>
+            </w:tcBorders>
+          </w:tcPr>
+          <w:p>
+            <w:pPr>
+              <w:jc w:val="left"/>
+            </w:pPr>
+            <w:r>
+              <w:rPr>
+                <w:b w:val="0"/>
+                <w:i w:val="0"/>
+                <w:sz w:val="16"/>
+              </w:rPr>
+              <w:t>4</w:t>
+            </w:r>
+          </w:p>
+        </w:tc>
         <w:tc>
           <w:tcPr>
             <w:tcW w:type="dxa" w:w="1984"/>
@@ -5158,33 +7488,7 @@
                 <w:i w:val="0"/>
                 <w:sz w:val="16"/>
               </w:rPr>
-              <w:t>Outcome</w:t>
-            </w:r>
-          </w:p>
-        </w:tc>
-        <w:tc>
-          <w:tcPr>
-            <w:tcW w:type="dxa" w:w="1134"/>
-            <w:vAlign w:val="center"/>
-            <w:shd w:val="clear" w:color="auto" w:fill="FFFFFF"/>
-            <w:tcBorders>
-              <w:top w:val="single" w:sz="4" w:space="0" w:color="dee2e6"/>
-              <w:left w:val="single" w:sz="4" w:space="0" w:color="dee2e6"/>
-              <w:bottom w:val="single" w:sz="4" w:space="0" w:color="dee2e6"/>
-              <w:right w:val="single" w:sz="4" w:space="0" w:color="dee2e6"/>
-            </w:tcBorders>
-          </w:tcPr>
-          <w:p>
-            <w:pPr>
-              <w:jc w:val="left"/>
-            </w:pPr>
-            <w:r>
-              <w:rPr>
-                <w:b w:val="0"/>
-                <w:i w:val="0"/>
-                <w:sz w:val="16"/>
-              </w:rPr>
-              <w:t>0</w:t>
+              <w:t>Minor failure</w:t>
             </w:r>
           </w:p>
         </w:tc>
@@ -5210,12 +7514,38 @@
                 <w:i w:val="0"/>
                 <w:sz w:val="16"/>
               </w:rPr>
-              <w:t>Success</w:t>
+              <w:t>Low — minor issue occurred</w:t>
             </w:r>
           </w:p>
         </w:tc>
       </w:tr>
       <w:tr>
+        <w:tc>
+          <w:tcPr>
+            <w:tcW w:type="dxa" w:w="850"/>
+            <w:vAlign w:val="center"/>
+            <w:shd w:val="clear" w:color="auto" w:fill="f8f9fa"/>
+            <w:tcBorders>
+              <w:top w:val="single" w:sz="4" w:space="0" w:color="dee2e6"/>
+              <w:left w:val="single" w:sz="4" w:space="0" w:color="dee2e6"/>
+              <w:bottom w:val="single" w:sz="4" w:space="0" w:color="dee2e6"/>
+              <w:right w:val="single" w:sz="4" w:space="0" w:color="dee2e6"/>
+            </w:tcBorders>
+          </w:tcPr>
+          <w:p>
+            <w:pPr>
+              <w:jc w:val="left"/>
+            </w:pPr>
+            <w:r>
+              <w:rPr>
+                <w:b w:val="0"/>
+                <w:i w:val="0"/>
+                <w:sz w:val="16"/>
+              </w:rPr>
+              <w:t>8</w:t>
+            </w:r>
+          </w:p>
+        </w:tc>
         <w:tc>
           <w:tcPr>
             <w:tcW w:type="dxa" w:w="1984"/>
@@ -5238,33 +7568,7 @@
                 <w:i w:val="0"/>
                 <w:sz w:val="16"/>
               </w:rPr>
-              <w:t>Outcome</w:t>
-            </w:r>
-          </w:p>
-        </w:tc>
-        <w:tc>
-          <w:tcPr>
-            <w:tcW w:type="dxa" w:w="1134"/>
-            <w:vAlign w:val="center"/>
-            <w:shd w:val="clear" w:color="auto" w:fill="f8f9fa"/>
-            <w:tcBorders>
-              <w:top w:val="single" w:sz="4" w:space="0" w:color="dee2e6"/>
-              <w:left w:val="single" w:sz="4" w:space="0" w:color="dee2e6"/>
-              <w:bottom w:val="single" w:sz="4" w:space="0" w:color="dee2e6"/>
-              <w:right w:val="single" w:sz="4" w:space="0" w:color="dee2e6"/>
-            </w:tcBorders>
-          </w:tcPr>
-          <w:p>
-            <w:pPr>
-              <w:jc w:val="left"/>
-            </w:pPr>
-            <w:r>
-              <w:rPr>
-                <w:b w:val="0"/>
-                <w:i w:val="0"/>
-                <w:sz w:val="16"/>
-              </w:rPr>
-              <w:t>4</w:t>
+              <w:t>Serious failure</w:t>
             </w:r>
           </w:p>
         </w:tc>
@@ -5290,12 +7594,38 @@
                 <w:i w:val="0"/>
                 <w:sz w:val="16"/>
               </w:rPr>
-              <w:t>Minor failure</w:t>
+              <w:t>High — significant problem</w:t>
             </w:r>
           </w:p>
         </w:tc>
       </w:tr>
       <w:tr>
+        <w:tc>
+          <w:tcPr>
+            <w:tcW w:type="dxa" w:w="850"/>
+            <w:vAlign w:val="center"/>
+            <w:shd w:val="clear" w:color="auto" w:fill="FFFFFF"/>
+            <w:tcBorders>
+              <w:top w:val="single" w:sz="4" w:space="0" w:color="dee2e6"/>
+              <w:left w:val="single" w:sz="4" w:space="0" w:color="dee2e6"/>
+              <w:bottom w:val="single" w:sz="4" w:space="0" w:color="dee2e6"/>
+              <w:right w:val="single" w:sz="4" w:space="0" w:color="dee2e6"/>
+            </w:tcBorders>
+          </w:tcPr>
+          <w:p>
+            <w:pPr>
+              <w:jc w:val="left"/>
+            </w:pPr>
+            <w:r>
+              <w:rPr>
+                <w:b w:val="0"/>
+                <w:i w:val="0"/>
+                <w:sz w:val="16"/>
+              </w:rPr>
+              <w:t>12</w:t>
+            </w:r>
+          </w:p>
+        </w:tc>
         <w:tc>
           <w:tcPr>
             <w:tcW w:type="dxa" w:w="1984"/>
@@ -5318,33 +7648,7 @@
                 <w:i w:val="0"/>
                 <w:sz w:val="16"/>
               </w:rPr>
-              <w:t>Outcome</w:t>
-            </w:r>
-          </w:p>
-        </w:tc>
-        <w:tc>
-          <w:tcPr>
-            <w:tcW w:type="dxa" w:w="1134"/>
-            <w:vAlign w:val="center"/>
-            <w:shd w:val="clear" w:color="auto" w:fill="FFFFFF"/>
-            <w:tcBorders>
-              <w:top w:val="single" w:sz="4" w:space="0" w:color="dee2e6"/>
-              <w:left w:val="single" w:sz="4" w:space="0" w:color="dee2e6"/>
-              <w:bottom w:val="single" w:sz="4" w:space="0" w:color="dee2e6"/>
-              <w:right w:val="single" w:sz="4" w:space="0" w:color="dee2e6"/>
-            </w:tcBorders>
-          </w:tcPr>
-          <w:p>
-            <w:pPr>
-              <w:jc w:val="left"/>
-            </w:pPr>
-            <w:r>
-              <w:rPr>
-                <w:b w:val="0"/>
-                <w:i w:val="0"/>
-                <w:sz w:val="16"/>
-              </w:rPr>
-              <w:t>8</w:t>
+              <w:t>Major failure</w:t>
             </w:r>
           </w:p>
         </w:tc>
@@ -5370,87 +7674,7 @@
                 <w:i w:val="0"/>
                 <w:sz w:val="16"/>
               </w:rPr>
-              <w:t>Serious failure</w:t>
-            </w:r>
-          </w:p>
-        </w:tc>
-      </w:tr>
-      <w:tr>
-        <w:tc>
-          <w:tcPr>
-            <w:tcW w:type="dxa" w:w="1984"/>
-            <w:vAlign w:val="center"/>
-            <w:shd w:val="clear" w:color="auto" w:fill="f8f9fa"/>
-            <w:tcBorders>
-              <w:top w:val="single" w:sz="4" w:space="0" w:color="dee2e6"/>
-              <w:left w:val="single" w:sz="4" w:space="0" w:color="dee2e6"/>
-              <w:bottom w:val="single" w:sz="4" w:space="0" w:color="dee2e6"/>
-              <w:right w:val="single" w:sz="4" w:space="0" w:color="dee2e6"/>
-            </w:tcBorders>
-          </w:tcPr>
-          <w:p>
-            <w:pPr>
-              <w:jc w:val="left"/>
-            </w:pPr>
-            <w:r>
-              <w:rPr>
-                <w:b w:val="0"/>
-                <w:i w:val="0"/>
-                <w:sz w:val="16"/>
-              </w:rPr>
-              <w:t>Outcome</w:t>
-            </w:r>
-          </w:p>
-        </w:tc>
-        <w:tc>
-          <w:tcPr>
-            <w:tcW w:type="dxa" w:w="1134"/>
-            <w:vAlign w:val="center"/>
-            <w:shd w:val="clear" w:color="auto" w:fill="f8f9fa"/>
-            <w:tcBorders>
-              <w:top w:val="single" w:sz="4" w:space="0" w:color="dee2e6"/>
-              <w:left w:val="single" w:sz="4" w:space="0" w:color="dee2e6"/>
-              <w:bottom w:val="single" w:sz="4" w:space="0" w:color="dee2e6"/>
-              <w:right w:val="single" w:sz="4" w:space="0" w:color="dee2e6"/>
-            </w:tcBorders>
-          </w:tcPr>
-          <w:p>
-            <w:pPr>
-              <w:jc w:val="left"/>
-            </w:pPr>
-            <w:r>
-              <w:rPr>
-                <w:b w:val="0"/>
-                <w:i w:val="0"/>
-                <w:sz w:val="16"/>
-              </w:rPr>
-              <w:t>12</w:t>
-            </w:r>
-          </w:p>
-        </w:tc>
-        <w:tc>
-          <w:tcPr>
-            <w:tcW w:type="dxa" w:w="6803"/>
-            <w:vAlign w:val="center"/>
-            <w:shd w:val="clear" w:color="auto" w:fill="f8f9fa"/>
-            <w:tcBorders>
-              <w:top w:val="single" w:sz="4" w:space="0" w:color="dee2e6"/>
-              <w:left w:val="single" w:sz="4" w:space="0" w:color="dee2e6"/>
-              <w:bottom w:val="single" w:sz="4" w:space="0" w:color="dee2e6"/>
-              <w:right w:val="single" w:sz="4" w:space="0" w:color="dee2e6"/>
-            </w:tcBorders>
-          </w:tcPr>
-          <w:p>
-            <w:pPr>
-              <w:jc w:val="left"/>
-            </w:pPr>
-            <w:r>
-              <w:rPr>
-                <w:b w:val="0"/>
-                <w:i w:val="0"/>
-                <w:sz w:val="16"/>
-              </w:rPr>
-              <w:t>Major failure</w:t>
+              <w:t>Critical — severe error</w:t>
             </w:r>
           </w:p>
         </w:tc>

</xml_diff>